<commit_message>
Organik bölüm tamamen ayrıldı: alan başına organik talimat ve form, ortak belge atıfları kaldırıldı
Co-Authored-By: Claude Sonnet 5.5 <noreply@anthropic.com>
Claude-Session: https://claude.ai/code/session_01J6foNXTwf1dGzDjULYpfrk
</commit_message>
<xml_diff>
--- a/prosedurler/EMS.OR.PRO.21.01. OCS Material Handling, Segregation and Traceability Procedure.docx
+++ b/prosedurler/EMS.OR.PRO.21.01. OCS Material Handling, Segregation and Traceability Procedure.docx
@@ -1037,7 +1037,7 @@
           <w:sz w:val="24"/>
           <w:szCs w:val="24"/>
         </w:rPr>
-        <w:t xml:space="preserve">7.1. Chemical inputs (dyes, auxiliaries, finishing and cleaning agents) used on GOTS orders are approved by the OCS Coordinator against the GOTS criteria and the ZDHC MRSL before purchase, and are listed in the chemical inventory (EMS.KM.PRO.20.01).</w:t>
+        <w:t xml:space="preserve">7.1. Chemical inputs (dyes, auxiliaries, finishing and cleaning agents) used on GOTS orders are approved by the OCS Coordinator against the GOTS criteria and the ZDHC MRSL before purchase, and are listed in the chemical inventory (EMS.OR.FRM.21.20).</w:t>
       </w:r>
     </w:p>
     <w:p>
@@ -1053,7 +1053,7 @@
           <w:sz w:val="24"/>
           <w:szCs w:val="24"/>
         </w:rPr>
-        <w:t xml:space="preserve">7.2. Approved chemicals are stored apart from other chemicals in the Chemical Storage Area (area 13), labelled, with a current safety data sheet, and issued to production with a record (EMS.KM.PRO.20.05, EMS.KM.TL.20.02).</w:t>
+        <w:t xml:space="preserve">7.2. Approved chemicals are stored apart from other chemicals in the Chemical Storage Area (area 13), labelled, with a current safety data sheet, and issued to production with a record (EMS.OR.TL.21.15).</w:t>
       </w:r>
     </w:p>
     <w:p>
@@ -1069,7 +1069,7 @@
           <w:sz w:val="24"/>
           <w:szCs w:val="24"/>
         </w:rPr>
-        <w:t xml:space="preserve">7.3. Wastewater from wet processing is treated in the effluent treatment plant and monitored, and the results are recorded (EMS.ÇV.PRO.19.02).</w:t>
+        <w:t xml:space="preserve">7.3. Wastewater from wet processing is treated in the effluent treatment plant and monitored, and the results are recorded (EMS.OR.TL.21.16).</w:t>
       </w:r>
     </w:p>
     <w:p>
@@ -1085,7 +1085,7 @@
           <w:sz w:val="24"/>
           <w:szCs w:val="24"/>
         </w:rPr>
-        <w:t xml:space="preserve">7.4. Waste is segregated at source, organic and conventional offcuts are not mixed, and hazardous waste is kept in the temporary storage area until collection by a licensed contractor (EMS.ÇV.TL.19.01, EMS.ÇV.PRO.19.05).</w:t>
+        <w:t xml:space="preserve">7.4. Waste is segregated at source, organic and conventional offcuts are not mixed, and hazardous waste is kept in the temporary storage area until collection by a licensed contractor (EMS.OR.TL.21.16).</w:t>
       </w:r>
     </w:p>
     <w:p>
@@ -1449,7 +1449,7 @@
           <w:sz w:val="24"/>
           <w:szCs w:val="24"/>
         </w:rPr>
-        <w:t xml:space="preserve">EMS.KM.PRO.20.01. Chemical Inventory and ZDHC MRSL Conformance Procedure</w:t>
+        <w:t xml:space="preserve">EMS.OR.FRM.21.20. Organic Chemical Receiving and Use Record</w:t>
       </w:r>
     </w:p>
     <w:p>
@@ -1468,7 +1468,7 @@
           <w:sz w:val="24"/>
           <w:szCs w:val="24"/>
         </w:rPr>
-        <w:t xml:space="preserve">EMS.KM.PRO.20.05. Chemical Storage and Handling Procedure</w:t>
+        <w:t xml:space="preserve">EMS.OR.TL.21.15. Organic Chemical Storage Area Instruction</w:t>
       </w:r>
     </w:p>
     <w:p>
@@ -1487,7 +1487,7 @@
           <w:sz w:val="24"/>
           <w:szCs w:val="24"/>
         </w:rPr>
-        <w:t xml:space="preserve">EMS.ÇV.PRO.19.02. Wastewater Management and Monitoring Procedure</w:t>
+        <w:t xml:space="preserve">EMS.OR.TL.21.16. Organic Waste and Segregation Area Instruction</w:t>
       </w:r>
     </w:p>
     <w:p>
@@ -1506,7 +1506,7 @@
           <w:sz w:val="24"/>
           <w:szCs w:val="24"/>
         </w:rPr>
-        <w:t xml:space="preserve">EMS.ÇV.TL.19.01. Waste Segregation Instruction</w:t>
+        <w:t xml:space="preserve">EMS.OR.TL.21.01. Organic Product Identification and Labelling Instruction</w:t>
       </w:r>
     </w:p>
     <w:p>
@@ -1525,7 +1525,7 @@
           <w:sz w:val="24"/>
           <w:szCs w:val="24"/>
         </w:rPr>
-        <w:t xml:space="preserve">EMS.GR.PRO.14.02. Transaction Certificate and Labelling Procedure</w:t>
+        <w:t xml:space="preserve">EMS.OR.PRO.21.01. OCS Material Handling, Segregation and Traceability Procedure</w:t>
       </w:r>
     </w:p>
     <w:p>
@@ -1544,7 +1544,1335 @@
           <w:sz w:val="24"/>
           <w:szCs w:val="24"/>
         </w:rPr>
-        <w:t xml:space="preserve">EMS.QA.PRO.02.08. Traceability and Product Recall Procedure</w:t>
+        <w:t xml:space="preserve">EMS.OR.TL.21.03. Organic Raw Material Area Instruction</w:t>
+      </w:r>
+    </w:p>
+    <w:p>
+      <w:pPr>
+        <w:pStyle w:val="ListeParagraf"/>
+        <w:spacing w:after="80"/>
+        <w:ind w:left="709" w:right="0"/>
+        <w:jc w:val="both"/>
+      </w:pPr>
+    </w:p>
+    <w:p>
+      <w:pPr>
+        <w:pStyle w:val="ListeParagraf"/>
+        <w:spacing w:before="120" w:after="60"/>
+        <w:ind w:left="709" w:right="0"/>
+      </w:pPr>
+      <w:r>
+        <w:rPr>
+          <w:rFonts w:ascii="Calibri" w:hAnsi="Calibri" w:cs="Arial"/>
+          <w:b/>
+          <w:bCs/>
+          <w:sz w:val="24"/>
+          <w:szCs w:val="24"/>
+        </w:rPr>
+        <w:t xml:space="preserve">10. FEEDBACK AND MONITORING</w:t>
+      </w:r>
+    </w:p>
+    <w:p>
+      <w:pPr>
+        <w:pStyle w:val="ListeParagraf"/>
+        <w:spacing w:after="80"/>
+        <w:ind w:left="709" w:right="0"/>
+        <w:jc w:val="both"/>
+      </w:pPr>
+      <w:r>
+        <w:rPr>
+          <w:rFonts w:ascii="Calibri" w:hAnsi="Calibri" w:cs="Arial"/>
+          <w:sz w:val="24"/>
+          <w:szCs w:val="24"/>
+        </w:rPr>
+        <w:t xml:space="preserve">This procedure is reviewed every year by the OCS Coordinator, or earlier when the OCS standard, customer requirements or the certificate scope change. Audit findings are evaluated and the procedure is revised when necessary.</w:t>
+      </w:r>
+    </w:p>
+    <w:p>
+      <w:r>
+        <w:br w:type="page"/>
+      </w:r>
+    </w:p>
+    <w:p>
+      <w:pPr>
+        <w:pStyle w:val="ListeParagraf"/>
+        <w:bidi/>
+        <w:spacing w:before="120" w:after="60"/>
+        <w:ind w:left="0" w:right="709"/>
+      </w:pPr>
+      <w:r>
+        <w:rPr>
+          <w:rFonts w:ascii="Calibri" w:hAnsi="Calibri" w:cs="Arial"/>
+          <w:b/>
+          <w:bCs/>
+          <w:rtl/>
+          <w:sz w:val="24"/>
+          <w:szCs w:val="24"/>
+        </w:rPr>
+        <w:t xml:space="preserve">الغرض</w:t>
+      </w:r>
+    </w:p>
+    <w:p>
+      <w:pPr>
+        <w:pStyle w:val="ListeParagraf"/>
+        <w:bidi/>
+        <w:spacing w:after="80"/>
+        <w:ind w:left="0" w:right="709"/>
+        <w:jc w:val="both"/>
+      </w:pPr>
+      <w:r>
+        <w:rPr>
+          <w:rFonts w:ascii="Calibri" w:hAnsi="Calibri" w:cs="Arial"/>
+          <w:rtl/>
+          <w:sz w:val="24"/>
+          <w:szCs w:val="24"/>
+        </w:rPr>
+        <w:t xml:space="preserve">يحدد هذا الإجراء كيفية استلام المواد العضوية المعتمدة وفق معيار GOTS أو OCS والتحقق منها وتمييزها وفصلها ومعالجتها وتتبعها من الاستلام حتى الشحن في شركة إيروغلو للتريكو (EMS)، بحيث يمكن إثبات المحتوى العضوي لكل منتج ومنع أي خلط أو تلوث.</w:t>
+      </w:r>
+    </w:p>
+    <w:p>
+      <w:pPr>
+        <w:pStyle w:val="ListeParagraf"/>
+        <w:bidi/>
+        <w:spacing w:after="80"/>
+        <w:ind w:left="0" w:right="709"/>
+        <w:jc w:val="both"/>
+      </w:pPr>
+    </w:p>
+    <w:p>
+      <w:pPr>
+        <w:pStyle w:val="ListeParagraf"/>
+        <w:bidi/>
+        <w:spacing w:before="120" w:after="60"/>
+        <w:ind w:left="0" w:right="709"/>
+      </w:pPr>
+      <w:r>
+        <w:rPr>
+          <w:rFonts w:ascii="Calibri" w:hAnsi="Calibri" w:cs="Arial"/>
+          <w:b/>
+          <w:bCs/>
+          <w:rtl/>
+          <w:sz w:val="24"/>
+          <w:szCs w:val="24"/>
+        </w:rPr>
+        <w:t xml:space="preserve">النطاق</w:t>
+      </w:r>
+    </w:p>
+    <w:p>
+      <w:pPr>
+        <w:pStyle w:val="ListeParagraf"/>
+        <w:bidi/>
+        <w:spacing w:after="80"/>
+        <w:ind w:left="0" w:right="709"/>
+        <w:jc w:val="both"/>
+      </w:pPr>
+      <w:r>
+        <w:rPr>
+          <w:rFonts w:ascii="Calibri" w:hAnsi="Calibri" w:cs="Arial"/>
+          <w:rtl/>
+          <w:sz w:val="24"/>
+          <w:szCs w:val="24"/>
+        </w:rPr>
+        <w:t xml:space="preserve">يشمل هذا الإجراء جميع الخيوط والأقمشة والإكسسوارات العضوية التي يُدّعى أنها وفق معيار GOTS أو OCS، بدءًا من الشراء والاستلام مرورًا بالتريكو والصباغة والتجهيز والقص والخياطة والتعبئة والتصنيع لدى الغير وحتى الشحن.</w:t>
+      </w:r>
+    </w:p>
+    <w:p>
+      <w:pPr>
+        <w:pStyle w:val="ListeParagraf"/>
+        <w:bidi/>
+        <w:spacing w:after="80"/>
+        <w:ind w:left="0" w:right="709"/>
+        <w:jc w:val="both"/>
+      </w:pPr>
+    </w:p>
+    <w:p>
+      <w:pPr>
+        <w:pStyle w:val="ListeParagraf"/>
+        <w:bidi/>
+        <w:spacing w:before="120" w:after="60"/>
+        <w:ind w:left="0" w:right="709"/>
+      </w:pPr>
+      <w:r>
+        <w:rPr>
+          <w:rFonts w:ascii="Calibri" w:hAnsi="Calibri" w:cs="Arial"/>
+          <w:b/>
+          <w:bCs/>
+          <w:rtl/>
+          <w:sz w:val="24"/>
+          <w:szCs w:val="24"/>
+        </w:rPr>
+        <w:t xml:space="preserve">المسؤوليات</w:t>
+      </w:r>
+    </w:p>
+    <w:p>
+      <w:pPr>
+        <w:pStyle w:val="ListeParagraf"/>
+        <w:bidi/>
+        <w:spacing w:after="80"/>
+        <w:ind w:left="0" w:right="709"/>
+        <w:jc w:val="both"/>
+      </w:pPr>
+      <w:r>
+        <w:rPr>
+          <w:rFonts w:ascii="Calibri" w:hAnsi="Calibri" w:cs="Arial"/>
+          <w:rtl/>
+          <w:sz w:val="24"/>
+          <w:szCs w:val="24"/>
+        </w:rPr>
+        <w:t xml:space="preserve">• </w:t>
+      </w:r>
+      <w:r>
+        <w:rPr>
+          <w:rFonts w:ascii="Calibri" w:hAnsi="Calibri" w:cs="Arial"/>
+          <w:b/>
+          <w:bCs/>
+          <w:rtl/>
+          <w:sz w:val="24"/>
+          <w:szCs w:val="24"/>
+        </w:rPr>
+        <w:t xml:space="preserve">منسق OCS:</w:t>
+      </w:r>
+      <w:r>
+        <w:rPr>
+          <w:rFonts w:ascii="Calibri" w:hAnsi="Calibri" w:cs="Arial"/>
+          <w:rtl/>
+          <w:sz w:val="24"/>
+          <w:szCs w:val="24"/>
+        </w:rPr>
+        <w:t xml:space="preserve"> يتحقق من شهادات الموردين وشهادات المعاملات الواردة، ويحتفظ بسجلات التتبع وموازنة الكميات، ويطلب شهادات المعاملات الصادرة.</w:t>
+      </w:r>
+    </w:p>
+    <w:p>
+      <w:pPr>
+        <w:pStyle w:val="ListeParagraf"/>
+        <w:bidi/>
+        <w:spacing w:after="80"/>
+        <w:ind w:left="0" w:right="709"/>
+        <w:jc w:val="both"/>
+      </w:pPr>
+      <w:r>
+        <w:rPr>
+          <w:rFonts w:ascii="Calibri" w:hAnsi="Calibri" w:cs="Arial"/>
+          <w:rtl/>
+          <w:sz w:val="24"/>
+          <w:szCs w:val="24"/>
+        </w:rPr>
+        <w:t xml:space="preserve">• </w:t>
+      </w:r>
+      <w:r>
+        <w:rPr>
+          <w:rFonts w:ascii="Calibri" w:hAnsi="Calibri" w:cs="Arial"/>
+          <w:b/>
+          <w:bCs/>
+          <w:rtl/>
+          <w:sz w:val="24"/>
+          <w:szCs w:val="24"/>
+        </w:rPr>
+        <w:t xml:space="preserve">مشرف المستودع:</w:t>
+      </w:r>
+      <w:r>
+        <w:rPr>
+          <w:rFonts w:ascii="Calibri" w:hAnsi="Calibri" w:cs="Arial"/>
+          <w:rtl/>
+          <w:sz w:val="24"/>
+          <w:szCs w:val="24"/>
+        </w:rPr>
+        <w:t xml:space="preserve"> يستلم مواد OCS ويضع عليها الملصقات ويخزنها في المنطقة المخصصة ويسجل جميع حركاتها.</w:t>
+      </w:r>
+    </w:p>
+    <w:p>
+      <w:pPr>
+        <w:pStyle w:val="ListeParagraf"/>
+        <w:bidi/>
+        <w:spacing w:after="80"/>
+        <w:ind w:left="0" w:right="709"/>
+        <w:jc w:val="both"/>
+      </w:pPr>
+      <w:r>
+        <w:rPr>
+          <w:rFonts w:ascii="Calibri" w:hAnsi="Calibri" w:cs="Arial"/>
+          <w:rtl/>
+          <w:sz w:val="24"/>
+          <w:szCs w:val="24"/>
+        </w:rPr>
+        <w:t xml:space="preserve">• </w:t>
+      </w:r>
+      <w:r>
+        <w:rPr>
+          <w:rFonts w:ascii="Calibri" w:hAnsi="Calibri" w:cs="Arial"/>
+          <w:b/>
+          <w:bCs/>
+          <w:rtl/>
+          <w:sz w:val="24"/>
+          <w:szCs w:val="24"/>
+        </w:rPr>
+        <w:t xml:space="preserve">تخطيط الإنتاج ومشرفو الأقسام:</w:t>
+      </w:r>
+      <w:r>
+        <w:rPr>
+          <w:rFonts w:ascii="Calibri" w:hAnsi="Calibri" w:cs="Arial"/>
+          <w:rtl/>
+          <w:sz w:val="24"/>
+          <w:szCs w:val="24"/>
+        </w:rPr>
+        <w:t xml:space="preserve"> يخططون طلبيات OCS بشكل منفصل، ويحافظون على تمييز مواد OCS أثناء المعالجة، ويسجلون الكميات والفاقد وأرقام الدفعات.</w:t>
+      </w:r>
+    </w:p>
+    <w:p>
+      <w:pPr>
+        <w:pStyle w:val="ListeParagraf"/>
+        <w:bidi/>
+        <w:spacing w:after="80"/>
+        <w:ind w:left="0" w:right="709"/>
+        <w:jc w:val="both"/>
+      </w:pPr>
+      <w:r>
+        <w:rPr>
+          <w:rFonts w:ascii="Calibri" w:hAnsi="Calibri" w:cs="Arial"/>
+          <w:rtl/>
+          <w:sz w:val="24"/>
+          <w:szCs w:val="24"/>
+        </w:rPr>
+        <w:t xml:space="preserve">• </w:t>
+      </w:r>
+      <w:r>
+        <w:rPr>
+          <w:rFonts w:ascii="Calibri" w:hAnsi="Calibri" w:cs="Arial"/>
+          <w:b/>
+          <w:bCs/>
+          <w:rtl/>
+          <w:sz w:val="24"/>
+          <w:szCs w:val="24"/>
+        </w:rPr>
+        <w:t xml:space="preserve">ضمان الجودة:</w:t>
+      </w:r>
+      <w:r>
+        <w:rPr>
+          <w:rFonts w:ascii="Calibri" w:hAnsi="Calibri" w:cs="Arial"/>
+          <w:rtl/>
+          <w:sz w:val="24"/>
+          <w:szCs w:val="24"/>
+        </w:rPr>
+        <w:t xml:space="preserve"> يتحقق من الفصل والتوسيم أثناء الفحص على خط الإنتاج وقبل الشحن.</w:t>
+      </w:r>
+    </w:p>
+    <w:p>
+      <w:pPr>
+        <w:pStyle w:val="ListeParagraf"/>
+        <w:bidi/>
+        <w:spacing w:after="80"/>
+        <w:ind w:left="0" w:right="709"/>
+        <w:jc w:val="both"/>
+      </w:pPr>
+    </w:p>
+    <w:p>
+      <w:pPr>
+        <w:pStyle w:val="ListeParagraf"/>
+        <w:bidi/>
+        <w:spacing w:before="120" w:after="60"/>
+        <w:ind w:left="0" w:right="709"/>
+      </w:pPr>
+      <w:r>
+        <w:rPr>
+          <w:rFonts w:ascii="Calibri" w:hAnsi="Calibri" w:cs="Arial"/>
+          <w:b/>
+          <w:bCs/>
+          <w:rtl/>
+          <w:sz w:val="24"/>
+          <w:szCs w:val="24"/>
+        </w:rPr>
+        <w:t xml:space="preserve">التعريفات</w:t>
+      </w:r>
+    </w:p>
+    <w:p>
+      <w:pPr>
+        <w:pStyle w:val="ListeParagraf"/>
+        <w:bidi/>
+        <w:spacing w:after="80"/>
+        <w:ind w:left="0" w:right="709"/>
+        <w:jc w:val="both"/>
+      </w:pPr>
+      <w:r>
+        <w:rPr>
+          <w:rFonts w:ascii="Calibri" w:hAnsi="Calibri" w:cs="Arial"/>
+          <w:rtl/>
+          <w:sz w:val="24"/>
+          <w:szCs w:val="24"/>
+        </w:rPr>
+        <w:t xml:space="preserve">• </w:t>
+      </w:r>
+      <w:r>
+        <w:rPr>
+          <w:rFonts w:ascii="Calibri" w:hAnsi="Calibri" w:cs="Arial"/>
+          <w:b/>
+          <w:bCs/>
+          <w:rtl/>
+          <w:sz w:val="24"/>
+          <w:szCs w:val="24"/>
+        </w:rPr>
+        <w:t xml:space="preserve">شهادة المعاملة الواردة:</w:t>
+      </w:r>
+      <w:r>
+        <w:rPr>
+          <w:rFonts w:ascii="Calibri" w:hAnsi="Calibri" w:cs="Arial"/>
+          <w:rtl/>
+          <w:sz w:val="24"/>
+          <w:szCs w:val="24"/>
+        </w:rPr>
+        <w:t xml:space="preserve"> شهادة المعاملة المستلمة من المورد للمواد العضوية الموردة إلى EMS.</w:t>
+      </w:r>
+    </w:p>
+    <w:p>
+      <w:pPr>
+        <w:pStyle w:val="ListeParagraf"/>
+        <w:bidi/>
+        <w:spacing w:after="80"/>
+        <w:ind w:left="0" w:right="709"/>
+        <w:jc w:val="both"/>
+      </w:pPr>
+      <w:r>
+        <w:rPr>
+          <w:rFonts w:ascii="Calibri" w:hAnsi="Calibri" w:cs="Arial"/>
+          <w:rtl/>
+          <w:sz w:val="24"/>
+          <w:szCs w:val="24"/>
+        </w:rPr>
+        <w:t xml:space="preserve">• </w:t>
+      </w:r>
+      <w:r>
+        <w:rPr>
+          <w:rFonts w:ascii="Calibri" w:hAnsi="Calibri" w:cs="Arial"/>
+          <w:b/>
+          <w:bCs/>
+          <w:rtl/>
+          <w:sz w:val="24"/>
+          <w:szCs w:val="24"/>
+        </w:rPr>
+        <w:t xml:space="preserve">موازنة الكميات:</w:t>
+      </w:r>
+      <w:r>
+        <w:rPr>
+          <w:rFonts w:ascii="Calibri" w:hAnsi="Calibri" w:cs="Arial"/>
+          <w:rtl/>
+          <w:sz w:val="24"/>
+          <w:szCs w:val="24"/>
+        </w:rPr>
+        <w:t xml:space="preserve"> مقارنة كمية المدخلات المعتمدة بكمية المخرجات المعتمدة وفاقد العمليات لطلبية أو لفترة معينة.</w:t>
+      </w:r>
+    </w:p>
+    <w:p>
+      <w:pPr>
+        <w:pStyle w:val="ListeParagraf"/>
+        <w:bidi/>
+        <w:spacing w:after="80"/>
+        <w:ind w:left="0" w:right="709"/>
+        <w:jc w:val="both"/>
+      </w:pPr>
+      <w:r>
+        <w:rPr>
+          <w:rFonts w:ascii="Calibri" w:hAnsi="Calibri" w:cs="Arial"/>
+          <w:rtl/>
+          <w:sz w:val="24"/>
+          <w:szCs w:val="24"/>
+        </w:rPr>
+        <w:t xml:space="preserve">• </w:t>
+      </w:r>
+      <w:r>
+        <w:rPr>
+          <w:rFonts w:ascii="Calibri" w:hAnsi="Calibri" w:cs="Arial"/>
+          <w:b/>
+          <w:bCs/>
+          <w:rtl/>
+          <w:sz w:val="24"/>
+          <w:szCs w:val="24"/>
+        </w:rPr>
+        <w:t xml:space="preserve">دفعة OCS:</w:t>
+      </w:r>
+      <w:r>
+        <w:rPr>
+          <w:rFonts w:ascii="Calibri" w:hAnsi="Calibri" w:cs="Arial"/>
+          <w:rtl/>
+          <w:sz w:val="24"/>
+          <w:szCs w:val="24"/>
+        </w:rPr>
+        <w:t xml:space="preserve"> كمية محددة من المواد العضوية لها رقم تعريف خاص بها ومرتبطة بشهادة المعاملة الواردة الخاصة بها.</w:t>
+      </w:r>
+    </w:p>
+    <w:p>
+      <w:pPr>
+        <w:pStyle w:val="ListeParagraf"/>
+        <w:bidi/>
+        <w:spacing w:after="80"/>
+        <w:ind w:left="0" w:right="709"/>
+        <w:jc w:val="both"/>
+      </w:pPr>
+      <w:r>
+        <w:rPr>
+          <w:rFonts w:ascii="Calibri" w:hAnsi="Calibri" w:cs="Arial"/>
+          <w:rtl/>
+          <w:sz w:val="24"/>
+          <w:szCs w:val="24"/>
+        </w:rPr>
+        <w:t xml:space="preserve">• </w:t>
+      </w:r>
+      <w:r>
+        <w:rPr>
+          <w:rFonts w:ascii="Calibri" w:hAnsi="Calibri" w:cs="Arial"/>
+          <w:b/>
+          <w:bCs/>
+          <w:rtl/>
+          <w:sz w:val="24"/>
+          <w:szCs w:val="24"/>
+        </w:rPr>
+        <w:t xml:space="preserve">منسق OCS:</w:t>
+      </w:r>
+      <w:r>
+        <w:rPr>
+          <w:rFonts w:ascii="Calibri" w:hAnsi="Calibri" w:cs="Arial"/>
+          <w:rtl/>
+          <w:sz w:val="24"/>
+          <w:szCs w:val="24"/>
+        </w:rPr>
+        <w:t xml:space="preserve"> الشخص المسؤول عن النظام العضوي. ويعمل أيضًا كمنسق GOTS عند معالجة طلبيات GOTS، وتنطبق القواعد نفسها على دفعات GOTS.</w:t>
+      </w:r>
+    </w:p>
+    <w:p>
+      <w:pPr>
+        <w:pStyle w:val="ListeParagraf"/>
+        <w:bidi/>
+        <w:spacing w:after="80"/>
+        <w:ind w:left="0" w:right="709"/>
+        <w:jc w:val="both"/>
+      </w:pPr>
+      <w:r>
+        <w:rPr>
+          <w:rFonts w:ascii="Calibri" w:hAnsi="Calibri" w:cs="Arial"/>
+          <w:rtl/>
+          <w:sz w:val="24"/>
+          <w:szCs w:val="24"/>
+        </w:rPr>
+        <w:t xml:space="preserve">• </w:t>
+      </w:r>
+      <w:r>
+        <w:rPr>
+          <w:rFonts w:ascii="Calibri" w:hAnsi="Calibri" w:cs="Arial"/>
+          <w:b/>
+          <w:bCs/>
+          <w:rtl/>
+          <w:sz w:val="24"/>
+          <w:szCs w:val="24"/>
+        </w:rPr>
+        <w:t xml:space="preserve">نظام الألوان:</w:t>
+      </w:r>
+      <w:r>
+        <w:rPr>
+          <w:rFonts w:ascii="Calibri" w:hAnsi="Calibri" w:cs="Arial"/>
+          <w:rtl/>
+          <w:sz w:val="24"/>
+          <w:szCs w:val="24"/>
+        </w:rPr>
+        <w:t xml:space="preserve"> أخضر = منطقة منتج عضوي، أزرق = منطقة تقليدية، أصفر = منطقة انتظار أو حجر، أحمر = منطقة غير مطابقة أو محظورة (انظر EMS.OR.PRO.21.02).</w:t>
+      </w:r>
+    </w:p>
+    <w:p>
+      <w:pPr>
+        <w:pStyle w:val="ListeParagraf"/>
+        <w:bidi/>
+        <w:spacing w:after="80"/>
+        <w:ind w:left="0" w:right="709"/>
+        <w:jc w:val="both"/>
+      </w:pPr>
+    </w:p>
+    <w:p>
+      <w:pPr>
+        <w:pStyle w:val="ListeParagraf"/>
+        <w:bidi/>
+        <w:spacing w:before="120" w:after="60"/>
+        <w:ind w:left="0" w:right="709"/>
+      </w:pPr>
+      <w:r>
+        <w:rPr>
+          <w:rFonts w:ascii="Calibri" w:hAnsi="Calibri" w:cs="Arial"/>
+          <w:b/>
+          <w:bCs/>
+          <w:rtl/>
+          <w:sz w:val="24"/>
+          <w:szCs w:val="24"/>
+        </w:rPr>
+        <w:t xml:space="preserve">العمليات الرئيسية والفرعية</w:t>
+      </w:r>
+    </w:p>
+    <w:p>
+      <w:pPr>
+        <w:pStyle w:val="ListeParagraf"/>
+        <w:bidi/>
+        <w:spacing w:before="120" w:after="60"/>
+        <w:ind w:left="0" w:right="709"/>
+      </w:pPr>
+      <w:r>
+        <w:rPr>
+          <w:rFonts w:ascii="Calibri" w:hAnsi="Calibri" w:cs="Arial"/>
+          <w:b/>
+          <w:bCs/>
+          <w:rtl/>
+          <w:sz w:val="24"/>
+          <w:szCs w:val="24"/>
+        </w:rPr>
+        <w:t xml:space="preserve">1. الشراء والتحقق من الموردين</w:t>
+      </w:r>
+    </w:p>
+    <w:p>
+      <w:pPr>
+        <w:pStyle w:val="ListeParagraf"/>
+        <w:bidi/>
+        <w:spacing w:after="80"/>
+        <w:ind w:left="0" w:right="709"/>
+        <w:jc w:val="both"/>
+      </w:pPr>
+      <w:r>
+        <w:rPr>
+          <w:rFonts w:ascii="Calibri" w:hAnsi="Calibri" w:cs="Arial"/>
+          <w:rtl/>
+          <w:sz w:val="24"/>
+          <w:szCs w:val="24"/>
+        </w:rPr>
+        <w:t xml:space="preserve">1.1. لا تُطلب المواد العضوية إلا من موردين لديهم شهادة نطاق GOTS أو OCS سارية تغطي المنتج؛ ويتحقق منسق OCS من الشهادة في قاعدة بيانات الشهادات العامة قبل إصدار الطلب.</w:t>
+      </w:r>
+    </w:p>
+    <w:p>
+      <w:pPr>
+        <w:pStyle w:val="ListeParagraf"/>
+        <w:bidi/>
+        <w:spacing w:after="80"/>
+        <w:ind w:left="0" w:right="709"/>
+        <w:jc w:val="both"/>
+      </w:pPr>
+      <w:r>
+        <w:rPr>
+          <w:rFonts w:ascii="Calibri" w:hAnsi="Calibri" w:cs="Arial"/>
+          <w:rtl/>
+          <w:sz w:val="24"/>
+          <w:szCs w:val="24"/>
+        </w:rPr>
+        <w:t xml:space="preserve">1.2. ينص أمر الشراء بوضوح على «OCS 100» أو «OCS Blended» ونسبة المحتوى العضوي وضرورة تقديم شهادة معاملة.</w:t>
+      </w:r>
+    </w:p>
+    <w:p>
+      <w:pPr>
+        <w:pStyle w:val="ListeParagraf"/>
+        <w:bidi/>
+        <w:spacing w:after="80"/>
+        <w:ind w:left="0" w:right="709"/>
+        <w:jc w:val="both"/>
+      </w:pPr>
+    </w:p>
+    <w:p>
+      <w:pPr>
+        <w:pStyle w:val="ListeParagraf"/>
+        <w:bidi/>
+        <w:spacing w:before="120" w:after="60"/>
+        <w:ind w:left="0" w:right="709"/>
+      </w:pPr>
+      <w:r>
+        <w:rPr>
+          <w:rFonts w:ascii="Calibri" w:hAnsi="Calibri" w:cs="Arial"/>
+          <w:b/>
+          <w:bCs/>
+          <w:rtl/>
+          <w:sz w:val="24"/>
+          <w:szCs w:val="24"/>
+        </w:rPr>
+        <w:t xml:space="preserve">2. الاستلام والتحقق</w:t>
+      </w:r>
+    </w:p>
+    <w:p>
+      <w:pPr>
+        <w:pStyle w:val="ListeParagraf"/>
+        <w:bidi/>
+        <w:spacing w:after="80"/>
+        <w:ind w:left="0" w:right="709"/>
+        <w:jc w:val="both"/>
+      </w:pPr>
+      <w:r>
+        <w:rPr>
+          <w:rFonts w:ascii="Calibri" w:hAnsi="Calibri" w:cs="Arial"/>
+          <w:rtl/>
+          <w:sz w:val="24"/>
+          <w:szCs w:val="24"/>
+        </w:rPr>
+        <w:t xml:space="preserve">2.1. عند الاستلام يتحقق المستودع من إذن التسليم والفاتورة وقائمة التعبئة، ومن أن العبوات موسومة كمواد عضوية.</w:t>
+      </w:r>
+    </w:p>
+    <w:p>
+      <w:pPr>
+        <w:pStyle w:val="ListeParagraf"/>
+        <w:bidi/>
+        <w:spacing w:after="80"/>
+        <w:ind w:left="0" w:right="709"/>
+        <w:jc w:val="both"/>
+      </w:pPr>
+      <w:r>
+        <w:rPr>
+          <w:rFonts w:ascii="Calibri" w:hAnsi="Calibri" w:cs="Arial"/>
+          <w:rtl/>
+          <w:sz w:val="24"/>
+          <w:szCs w:val="24"/>
+        </w:rPr>
+        <w:t xml:space="preserve">2.2. يتحقق منسق OCS من أن الكميات ووصف المنتج والبائع والمشتري الواردة في شهادة المعاملة الواردة (أو بيانات الشحنة المرسلة لإصدار الشهادة) تطابق التوريد.</w:t>
+      </w:r>
+    </w:p>
+    <w:p>
+      <w:pPr>
+        <w:pStyle w:val="ListeParagraf"/>
+        <w:bidi/>
+        <w:spacing w:after="80"/>
+        <w:ind w:left="0" w:right="709"/>
+        <w:jc w:val="both"/>
+      </w:pPr>
+      <w:r>
+        <w:rPr>
+          <w:rFonts w:ascii="Calibri" w:hAnsi="Calibri" w:cs="Arial"/>
+          <w:rtl/>
+          <w:sz w:val="24"/>
+          <w:szCs w:val="24"/>
+        </w:rPr>
+        <w:t xml:space="preserve">2.3. تُوقف المواد التي لا تتطابق وثائقها في منطقة الحجر، ولا تُستخدم كمواد عضوية حتى تُحل المشكلة.</w:t>
+      </w:r>
+    </w:p>
+    <w:p>
+      <w:pPr>
+        <w:pStyle w:val="ListeParagraf"/>
+        <w:bidi/>
+        <w:spacing w:after="80"/>
+        <w:ind w:left="0" w:right="709"/>
+        <w:jc w:val="both"/>
+      </w:pPr>
+    </w:p>
+    <w:p>
+      <w:pPr>
+        <w:pStyle w:val="ListeParagraf"/>
+        <w:bidi/>
+        <w:spacing w:before="120" w:after="60"/>
+        <w:ind w:left="0" w:right="709"/>
+      </w:pPr>
+      <w:r>
+        <w:rPr>
+          <w:rFonts w:ascii="Calibri" w:hAnsi="Calibri" w:cs="Arial"/>
+          <w:b/>
+          <w:bCs/>
+          <w:rtl/>
+          <w:sz w:val="24"/>
+          <w:szCs w:val="24"/>
+        </w:rPr>
+        <w:t xml:space="preserve">3. التمييز والفصل</w:t>
+      </w:r>
+    </w:p>
+    <w:p>
+      <w:pPr>
+        <w:pStyle w:val="ListeParagraf"/>
+        <w:bidi/>
+        <w:spacing w:after="80"/>
+        <w:ind w:left="0" w:right="709"/>
+        <w:jc w:val="both"/>
+      </w:pPr>
+      <w:r>
+        <w:rPr>
+          <w:rFonts w:ascii="Calibri" w:hAnsi="Calibri" w:cs="Arial"/>
+          <w:rtl/>
+          <w:sz w:val="24"/>
+          <w:szCs w:val="24"/>
+        </w:rPr>
+        <w:t xml:space="preserve">3.1. تُعطى كل دفعة OCS رقم دفعة وملصقًا أخضر «OCS – عضوي» يبين رقم الدفعة والمورد والكمية ورقم شهادة المعاملة.</w:t>
+      </w:r>
+    </w:p>
+    <w:p>
+      <w:pPr>
+        <w:pStyle w:val="ListeParagraf"/>
+        <w:bidi/>
+        <w:spacing w:after="80"/>
+        <w:ind w:left="0" w:right="709"/>
+        <w:jc w:val="both"/>
+      </w:pPr>
+      <w:r>
+        <w:rPr>
+          <w:rFonts w:ascii="Calibri" w:hAnsi="Calibri" w:cs="Arial"/>
+          <w:rtl/>
+          <w:sz w:val="24"/>
+          <w:szCs w:val="24"/>
+        </w:rPr>
+        <w:t xml:space="preserve">3.2. تُخزن مواد OCS في منطقة أو رف منفصل ومحدد بوضوح، ولا تُخزن أبدًا على نفس المنصة أو في نفس الصندوق مع المواد التقليدية.</w:t>
+      </w:r>
+    </w:p>
+    <w:p>
+      <w:pPr>
+        <w:pStyle w:val="ListeParagraf"/>
+        <w:bidi/>
+        <w:spacing w:after="80"/>
+        <w:ind w:left="0" w:right="709"/>
+        <w:jc w:val="both"/>
+      </w:pPr>
+      <w:r>
+        <w:rPr>
+          <w:rFonts w:ascii="Calibri" w:hAnsi="Calibri" w:cs="Arial"/>
+          <w:rtl/>
+          <w:sz w:val="24"/>
+          <w:szCs w:val="24"/>
+        </w:rPr>
+        <w:t xml:space="preserve">3.3. قبل بدء طلبية OCS تُنظف الآلات وطاولات القص وخطوط الخياطة، ويُنفذ تفريغ الخط ويُسجل.</w:t>
+      </w:r>
+    </w:p>
+    <w:p>
+      <w:pPr>
+        <w:pStyle w:val="ListeParagraf"/>
+        <w:bidi/>
+        <w:spacing w:after="80"/>
+        <w:ind w:left="0" w:right="709"/>
+        <w:jc w:val="both"/>
+      </w:pPr>
+      <w:r>
+        <w:rPr>
+          <w:rFonts w:ascii="Calibri" w:hAnsi="Calibri" w:cs="Arial"/>
+          <w:rtl/>
+          <w:sz w:val="24"/>
+          <w:szCs w:val="24"/>
+        </w:rPr>
+        <w:t xml:space="preserve">3.4. تحمل المنتجات قيد التصنيع والقطع المقصوصة والمنتجات النهائية علامات تمييز OCS (ملصقات أو بطاقات حزم ملونة أو بطاقات تعريف) في كل مرحلة.</w:t>
+      </w:r>
+    </w:p>
+    <w:p>
+      <w:pPr>
+        <w:pStyle w:val="ListeParagraf"/>
+        <w:bidi/>
+        <w:spacing w:after="80"/>
+        <w:ind w:left="0" w:right="709"/>
+        <w:jc w:val="both"/>
+      </w:pPr>
+      <w:r>
+        <w:rPr>
+          <w:rFonts w:ascii="Calibri" w:hAnsi="Calibri" w:cs="Arial"/>
+          <w:rtl/>
+          <w:sz w:val="24"/>
+          <w:szCs w:val="24"/>
+        </w:rPr>
+        <w:t xml:space="preserve">3.5. تُعالج طلبيات OCS قدر الإمكان في دفعات منفصلة أو في بداية الوردية؛ ولا يُسمح بالتحميل المختلط مع المواد التقليدية.</w:t>
+      </w:r>
+    </w:p>
+    <w:p>
+      <w:pPr>
+        <w:pStyle w:val="ListeParagraf"/>
+        <w:bidi/>
+        <w:spacing w:after="80"/>
+        <w:ind w:left="0" w:right="709"/>
+        <w:jc w:val="both"/>
+      </w:pPr>
+      <w:r>
+        <w:rPr>
+          <w:rFonts w:ascii="Calibri" w:hAnsi="Calibri" w:cs="Arial"/>
+          <w:rtl/>
+          <w:sz w:val="24"/>
+          <w:szCs w:val="24"/>
+        </w:rPr>
+        <w:t xml:space="preserve">3.6. تُحدد مناطق الإنتاج العضوي ونظام ألوانها ولافتاتها وقواعد الدخول إليها في EMS.OR.PRO.21.02؛ وتُبيَّن طريقة التنظيف عند التبديل وتفريغ الخط في EMS.OR.TL.21.02 وتُسجل في سجل التبديل وتفريغ الخط (EMS.OR.FRM.21.03).</w:t>
+      </w:r>
+    </w:p>
+    <w:p>
+      <w:pPr>
+        <w:pStyle w:val="ListeParagraf"/>
+        <w:bidi/>
+        <w:spacing w:after="80"/>
+        <w:ind w:left="0" w:right="709"/>
+        <w:jc w:val="both"/>
+      </w:pPr>
+      <w:r>
+        <w:rPr>
+          <w:rFonts w:ascii="Calibri" w:hAnsi="Calibri" w:cs="Arial"/>
+          <w:rtl/>
+          <w:sz w:val="24"/>
+          <w:szCs w:val="24"/>
+        </w:rPr>
+        <w:t xml:space="preserve">3.7. تُنقل المواد غير الموسومة أو المشكوك فيها أو المنتظرة للقرار إلى منطقة انتظار صفراء؛ وتُنقل المواد غير المطابقة إلى منطقة حمراء محظورة ولا تُستخدم أبدًا كمواد عضوية.</w:t>
+      </w:r>
+    </w:p>
+    <w:p>
+      <w:pPr>
+        <w:pStyle w:val="ListeParagraf"/>
+        <w:bidi/>
+        <w:spacing w:after="80"/>
+        <w:ind w:left="0" w:right="709"/>
+        <w:jc w:val="both"/>
+      </w:pPr>
+    </w:p>
+    <w:p>
+      <w:pPr>
+        <w:pStyle w:val="ListeParagraf"/>
+        <w:bidi/>
+        <w:spacing w:before="120" w:after="60"/>
+        <w:ind w:left="0" w:right="709"/>
+      </w:pPr>
+      <w:r>
+        <w:rPr>
+          <w:rFonts w:ascii="Calibri" w:hAnsi="Calibri" w:cs="Arial"/>
+          <w:b/>
+          <w:bCs/>
+          <w:rtl/>
+          <w:sz w:val="24"/>
+          <w:szCs w:val="24"/>
+        </w:rPr>
+        <w:t xml:space="preserve">4. التتبع وموازنة الكميات</w:t>
+      </w:r>
+    </w:p>
+    <w:p>
+      <w:pPr>
+        <w:pStyle w:val="ListeParagraf"/>
+        <w:bidi/>
+        <w:spacing w:after="80"/>
+        <w:ind w:left="0" w:right="709"/>
+        <w:jc w:val="both"/>
+      </w:pPr>
+      <w:r>
+        <w:rPr>
+          <w:rFonts w:ascii="Calibri" w:hAnsi="Calibri" w:cs="Arial"/>
+          <w:rtl/>
+          <w:sz w:val="24"/>
+          <w:szCs w:val="24"/>
+        </w:rPr>
+        <w:t xml:space="preserve">4.1. لكل طلبية OCS تربط سجلات الإنتاج رقم دفعة المدخلات وشهادة المعاملة بسجلات التريكو ودفعة الصباغة والقص والخياطة والتعبئة.</w:t>
+      </w:r>
+    </w:p>
+    <w:p>
+      <w:pPr>
+        <w:pStyle w:val="ListeParagraf"/>
+        <w:bidi/>
+        <w:spacing w:after="80"/>
+        <w:ind w:left="0" w:right="709"/>
+        <w:jc w:val="both"/>
+      </w:pPr>
+      <w:r>
+        <w:rPr>
+          <w:rFonts w:ascii="Calibri" w:hAnsi="Calibri" w:cs="Arial"/>
+          <w:rtl/>
+          <w:sz w:val="24"/>
+          <w:szCs w:val="24"/>
+        </w:rPr>
+        <w:t xml:space="preserve">4.2. تُسجل كميات المدخلات والمخرجات والفاقد والمرفوضات في كل مرحلة، باستخدام معاملات تحويل يعتمدها منسق OCS.</w:t>
+      </w:r>
+    </w:p>
+    <w:p>
+      <w:pPr>
+        <w:pStyle w:val="ListeParagraf"/>
+        <w:bidi/>
+        <w:spacing w:after="80"/>
+        <w:ind w:left="0" w:right="709"/>
+        <w:jc w:val="both"/>
+      </w:pPr>
+      <w:r>
+        <w:rPr>
+          <w:rFonts w:ascii="Calibri" w:hAnsi="Calibri" w:cs="Arial"/>
+          <w:rtl/>
+          <w:sz w:val="24"/>
+          <w:szCs w:val="24"/>
+        </w:rPr>
+        <w:t xml:space="preserve">4.3. تُجرى موازنة الكميات لكل طلبية وتُلخص كل ربع سنة؛ ولا يجوز أبدًا أن تتجاوز المخرجات المُدّعى أنها عضوية كمية المدخلات المعتمدة مطروحًا منها فاقد العمليات.</w:t>
+      </w:r>
+    </w:p>
+    <w:p>
+      <w:pPr>
+        <w:pStyle w:val="ListeParagraf"/>
+        <w:bidi/>
+        <w:spacing w:after="80"/>
+        <w:ind w:left="0" w:right="709"/>
+        <w:jc w:val="both"/>
+      </w:pPr>
+      <w:r>
+        <w:rPr>
+          <w:rFonts w:ascii="Calibri" w:hAnsi="Calibri" w:cs="Arial"/>
+          <w:rtl/>
+          <w:sz w:val="24"/>
+          <w:szCs w:val="24"/>
+        </w:rPr>
+        <w:t xml:space="preserve">4.4. تُحفظ النفايات والقصاصات العضوية منفصلة وتُسجل.</w:t>
+      </w:r>
+    </w:p>
+    <w:p>
+      <w:pPr>
+        <w:pStyle w:val="ListeParagraf"/>
+        <w:bidi/>
+        <w:spacing w:after="80"/>
+        <w:ind w:left="0" w:right="709"/>
+        <w:jc w:val="both"/>
+      </w:pPr>
+      <w:r>
+        <w:rPr>
+          <w:rFonts w:ascii="Calibri" w:hAnsi="Calibri" w:cs="Arial"/>
+          <w:rtl/>
+          <w:sz w:val="24"/>
+          <w:szCs w:val="24"/>
+        </w:rPr>
+        <w:t xml:space="preserve">4.5. تُسجل موازنة الكميات في سجل موازنة الكتلة العضوية (EMS.OR.FRM.21.04). وتُدرج كل دفعة في سجل تتبع الدفعات العضوية (EMS.OR.FRM.21.02) عند صرفها للإنتاج.</w:t>
+      </w:r>
+    </w:p>
+    <w:p>
+      <w:pPr>
+        <w:pStyle w:val="ListeParagraf"/>
+        <w:bidi/>
+        <w:spacing w:after="80"/>
+        <w:ind w:left="0" w:right="709"/>
+        <w:jc w:val="both"/>
+      </w:pPr>
+      <w:r>
+        <w:rPr>
+          <w:rFonts w:ascii="Calibri" w:hAnsi="Calibri" w:cs="Arial"/>
+          <w:rtl/>
+          <w:sz w:val="24"/>
+          <w:szCs w:val="24"/>
+        </w:rPr>
+        <w:t xml:space="preserve">4.6. يُحقق في أي فرق غير مبرر بين المدخلات والمخرجات المعتمدة؛ وحد التنبيه الداخلي هو 2% من كمية المدخلات (سياسة الشركة)، ويُبلَّغ الفرق إلى جهة الاعتماد عندما يتعذر تفسيره.</w:t>
+      </w:r>
+    </w:p>
+    <w:p>
+      <w:pPr>
+        <w:pStyle w:val="ListeParagraf"/>
+        <w:bidi/>
+        <w:spacing w:after="80"/>
+        <w:ind w:left="0" w:right="709"/>
+        <w:jc w:val="both"/>
+      </w:pPr>
+    </w:p>
+    <w:p>
+      <w:pPr>
+        <w:pStyle w:val="ListeParagraf"/>
+        <w:bidi/>
+        <w:spacing w:before="120" w:after="60"/>
+        <w:ind w:left="0" w:right="709"/>
+      </w:pPr>
+      <w:r>
+        <w:rPr>
+          <w:rFonts w:ascii="Calibri" w:hAnsi="Calibri" w:cs="Arial"/>
+          <w:b/>
+          <w:bCs/>
+          <w:rtl/>
+          <w:sz w:val="24"/>
+          <w:szCs w:val="24"/>
+        </w:rPr>
+        <w:t xml:space="preserve">5. التصنيع لدى الغير</w:t>
+      </w:r>
+    </w:p>
+    <w:p>
+      <w:pPr>
+        <w:pStyle w:val="ListeParagraf"/>
+        <w:bidi/>
+        <w:spacing w:after="80"/>
+        <w:ind w:left="0" w:right="709"/>
+        <w:jc w:val="both"/>
+      </w:pPr>
+      <w:r>
+        <w:rPr>
+          <w:rFonts w:ascii="Calibri" w:hAnsi="Calibri" w:cs="Arial"/>
+          <w:rtl/>
+          <w:sz w:val="24"/>
+          <w:szCs w:val="24"/>
+        </w:rPr>
+        <w:t xml:space="preserve">5.1. لا تُرسل مواد OCS إلا إلى مقاولين من الباطن لديهم شهادة نطاق OCS سارية أو مدرجين ضمن نطاق شهادة EMS.</w:t>
+      </w:r>
+    </w:p>
+    <w:p>
+      <w:pPr>
+        <w:pStyle w:val="ListeParagraf"/>
+        <w:bidi/>
+        <w:spacing w:after="80"/>
+        <w:ind w:left="0" w:right="709"/>
+        <w:jc w:val="both"/>
+      </w:pPr>
+      <w:r>
+        <w:rPr>
+          <w:rFonts w:ascii="Calibri" w:hAnsi="Calibri" w:cs="Arial"/>
+          <w:rtl/>
+          <w:sz w:val="24"/>
+          <w:szCs w:val="24"/>
+        </w:rPr>
+        <w:t xml:space="preserve">5.2. تُسجل كميات الإرسال والإرجاع، ويحافظ المقاول من الباطن على فصل المواد وتمييزها.</w:t>
+      </w:r>
+    </w:p>
+    <w:p>
+      <w:pPr>
+        <w:pStyle w:val="ListeParagraf"/>
+        <w:bidi/>
+        <w:spacing w:after="80"/>
+        <w:ind w:left="0" w:right="709"/>
+        <w:jc w:val="both"/>
+      </w:pPr>
+      <w:r>
+        <w:rPr>
+          <w:rFonts w:ascii="Calibri" w:hAnsi="Calibri" w:cs="Arial"/>
+          <w:rtl/>
+          <w:sz w:val="24"/>
+          <w:szCs w:val="24"/>
+        </w:rPr>
+        <w:t xml:space="preserve">5.3. بالنسبة لطلبيات GOTS، يجب أن يحمل المقاولون من الباطن الذين ينفذون المعالجة الرطبة أو الطباعة أو الخياطة شهادة نطاق GOTS سارية خاصة بهم أو أن يكونوا مدرجين في نطاق EMS؛ ويجوز لـ EMS ولجهة الاعتماد زيارتهم بإعلان مسبق أو دونه.</w:t>
+      </w:r>
+    </w:p>
+    <w:p>
+      <w:pPr>
+        <w:pStyle w:val="ListeParagraf"/>
+        <w:bidi/>
+        <w:spacing w:after="80"/>
+        <w:ind w:left="0" w:right="709"/>
+        <w:jc w:val="both"/>
+      </w:pPr>
+    </w:p>
+    <w:p>
+      <w:pPr>
+        <w:pStyle w:val="ListeParagraf"/>
+        <w:bidi/>
+        <w:spacing w:before="120" w:after="60"/>
+        <w:ind w:left="0" w:right="709"/>
+      </w:pPr>
+      <w:r>
+        <w:rPr>
+          <w:rFonts w:ascii="Calibri" w:hAnsi="Calibri" w:cs="Arial"/>
+          <w:b/>
+          <w:bCs/>
+          <w:rtl/>
+          <w:sz w:val="24"/>
+          <w:szCs w:val="24"/>
+        </w:rPr>
+        <w:t xml:space="preserve">6. الشحن والتوسيم وطلب شهادة المعاملة</w:t>
+      </w:r>
+    </w:p>
+    <w:p>
+      <w:pPr>
+        <w:pStyle w:val="ListeParagraf"/>
+        <w:bidi/>
+        <w:spacing w:after="80"/>
+        <w:ind w:left="0" w:right="709"/>
+        <w:jc w:val="both"/>
+      </w:pPr>
+      <w:r>
+        <w:rPr>
+          <w:rFonts w:ascii="Calibri" w:hAnsi="Calibri" w:cs="Arial"/>
+          <w:rtl/>
+          <w:sz w:val="24"/>
+          <w:szCs w:val="24"/>
+        </w:rPr>
+        <w:t xml:space="preserve">6.1. لا تحمل المنتجات النهائية ادعاءات OCS إلا وفقًا للتصميم المعتمد من العميل وقواعد التوسيم في معيار OCS.</w:t>
+      </w:r>
+    </w:p>
+    <w:p>
+      <w:pPr>
+        <w:pStyle w:val="ListeParagraf"/>
+        <w:bidi/>
+        <w:spacing w:after="80"/>
+        <w:ind w:left="0" w:right="709"/>
+        <w:jc w:val="both"/>
+      </w:pPr>
+      <w:r>
+        <w:rPr>
+          <w:rFonts w:ascii="Calibri" w:hAnsi="Calibri" w:cs="Arial"/>
+          <w:rtl/>
+          <w:sz w:val="24"/>
+          <w:szCs w:val="24"/>
+        </w:rPr>
+        <w:t xml:space="preserve">6.2. بعد الشحن يرسل منسق OCS بيانات الشحنة إلى جهة الاعتماد ويطلب شهادة المعاملة الصادرة في الوقت المحدد.</w:t>
+      </w:r>
+    </w:p>
+    <w:p>
+      <w:pPr>
+        <w:pStyle w:val="ListeParagraf"/>
+        <w:bidi/>
+        <w:spacing w:after="80"/>
+        <w:ind w:left="0" w:right="709"/>
+        <w:jc w:val="both"/>
+      </w:pPr>
+      <w:r>
+        <w:rPr>
+          <w:rFonts w:ascii="Calibri" w:hAnsi="Calibri" w:cs="Arial"/>
+          <w:rtl/>
+          <w:sz w:val="24"/>
+          <w:szCs w:val="24"/>
+        </w:rPr>
+        <w:t xml:space="preserve">6.3. تُحفظ شهادات المعاملات والفواتير وقوائم التعبئة وبوالص الشحن معًا لكل شحنة.</w:t>
+      </w:r>
+    </w:p>
+    <w:p>
+      <w:pPr>
+        <w:pStyle w:val="ListeParagraf"/>
+        <w:bidi/>
+        <w:spacing w:after="80"/>
+        <w:ind w:left="0" w:right="709"/>
+        <w:jc w:val="both"/>
+      </w:pPr>
+      <w:r>
+        <w:rPr>
+          <w:rFonts w:ascii="Calibri" w:hAnsi="Calibri" w:cs="Arial"/>
+          <w:rtl/>
+          <w:sz w:val="24"/>
+          <w:szCs w:val="24"/>
+        </w:rPr>
+        <w:t xml:space="preserve">6.4. قبل الإرسال يُستكمل نموذج الشحن وطلب شهادة المعاملة (EMS.OR.FRM.21.07): تُفحص الملصقات والكراتين والوثائق، ويُذكر رقم الشهادة والادعاء العضوي في وثائق المبيعات.</w:t>
+      </w:r>
+    </w:p>
+    <w:p>
+      <w:pPr>
+        <w:pStyle w:val="ListeParagraf"/>
+        <w:bidi/>
+        <w:spacing w:after="80"/>
+        <w:ind w:left="0" w:right="709"/>
+        <w:jc w:val="both"/>
+      </w:pPr>
+    </w:p>
+    <w:p>
+      <w:pPr>
+        <w:pStyle w:val="ListeParagraf"/>
+        <w:bidi/>
+        <w:spacing w:before="120" w:after="60"/>
+        <w:ind w:left="0" w:right="709"/>
+      </w:pPr>
+      <w:r>
+        <w:rPr>
+          <w:rFonts w:ascii="Calibri" w:hAnsi="Calibri" w:cs="Arial"/>
+          <w:b/>
+          <w:bCs/>
+          <w:rtl/>
+          <w:sz w:val="24"/>
+          <w:szCs w:val="24"/>
+        </w:rPr>
+        <w:t xml:space="preserve">7. المتطلبات البيئية والاجتماعية لمعيار GOTS</w:t>
+      </w:r>
+    </w:p>
+    <w:p>
+      <w:pPr>
+        <w:pStyle w:val="ListeParagraf"/>
+        <w:bidi/>
+        <w:spacing w:after="80"/>
+        <w:ind w:left="0" w:right="709"/>
+        <w:jc w:val="both"/>
+      </w:pPr>
+      <w:r>
+        <w:rPr>
+          <w:rFonts w:ascii="Calibri" w:hAnsi="Calibri" w:cs="Arial"/>
+          <w:rtl/>
+          <w:sz w:val="24"/>
+          <w:szCs w:val="24"/>
+        </w:rPr>
+        <w:t xml:space="preserve">7.1. يعتمد منسق OCS المدخلات الكيميائية (الأصباغ والمواد المساعدة ومواد التجهيز والتنظيف) المستخدمة في طلبيات GOTS وفق معايير GOTS وقائمة ZDHC MRSL قبل شرائها، وتُدرج في جرد المواد الكيميائية (EMS.OR.FRM.21.20).</w:t>
+      </w:r>
+    </w:p>
+    <w:p>
+      <w:pPr>
+        <w:pStyle w:val="ListeParagraf"/>
+        <w:bidi/>
+        <w:spacing w:after="80"/>
+        <w:ind w:left="0" w:right="709"/>
+        <w:jc w:val="both"/>
+      </w:pPr>
+      <w:r>
+        <w:rPr>
+          <w:rFonts w:ascii="Calibri" w:hAnsi="Calibri" w:cs="Arial"/>
+          <w:rtl/>
+          <w:sz w:val="24"/>
+          <w:szCs w:val="24"/>
+        </w:rPr>
+        <w:t xml:space="preserve">7.2. تُخزن المواد الكيميائية المعتمدة بمعزل عن بقية المواد الكيميائية في منطقة تخزين المواد الكيميائية (المنطقة 13)، وتكون موسومة ومعها ورقة بيانات سلامة حديثة، وتُصرف للإنتاج مع تسجيل (EMS.OR.TL.21.15).</w:t>
+      </w:r>
+    </w:p>
+    <w:p>
+      <w:pPr>
+        <w:pStyle w:val="ListeParagraf"/>
+        <w:bidi/>
+        <w:spacing w:after="80"/>
+        <w:ind w:left="0" w:right="709"/>
+        <w:jc w:val="both"/>
+      </w:pPr>
+      <w:r>
+        <w:rPr>
+          <w:rFonts w:ascii="Calibri" w:hAnsi="Calibri" w:cs="Arial"/>
+          <w:rtl/>
+          <w:sz w:val="24"/>
+          <w:szCs w:val="24"/>
+        </w:rPr>
+        <w:t xml:space="preserve">7.3. تُعالج مياه الصرف الناتجة عن المعالجة الرطبة في محطة معالجة المياه وتُراقب وتُسجل النتائج (EMS.OR.TL.21.16).</w:t>
+      </w:r>
+    </w:p>
+    <w:p>
+      <w:pPr>
+        <w:pStyle w:val="ListeParagraf"/>
+        <w:bidi/>
+        <w:spacing w:after="80"/>
+        <w:ind w:left="0" w:right="709"/>
+        <w:jc w:val="both"/>
+      </w:pPr>
+      <w:r>
+        <w:rPr>
+          <w:rFonts w:ascii="Calibri" w:hAnsi="Calibri" w:cs="Arial"/>
+          <w:rtl/>
+          <w:sz w:val="24"/>
+          <w:szCs w:val="24"/>
+        </w:rPr>
+        <w:t xml:space="preserve">7.4. تُفرز النفايات عند المصدر، ولا تُخلط قصاصات المواد العضوية والتقليدية، وتُحفظ النفايات الخطرة في منطقة التخزين المؤقت حتى تجمعها شركة مرخصة (EMS.OR.TL.21.16).</w:t>
+      </w:r>
+    </w:p>
+    <w:p>
+      <w:pPr>
+        <w:pStyle w:val="ListeParagraf"/>
+        <w:bidi/>
+        <w:spacing w:after="80"/>
+        <w:ind w:left="0" w:right="709"/>
+        <w:jc w:val="both"/>
+      </w:pPr>
+      <w:r>
+        <w:rPr>
+          <w:rFonts w:ascii="Calibri" w:hAnsi="Calibri" w:cs="Arial"/>
+          <w:rtl/>
+          <w:sz w:val="24"/>
+          <w:szCs w:val="24"/>
+        </w:rPr>
+        <w:t xml:space="preserve">7.5. تُطبق المعايير الاجتماعية في GOTS، القائمة على اتفاقيات العمل الدولية الأساسية، من خلال إجراءات الموارد البشرية والامتثال الاجتماعي في EMS، وتُراجع في التدقيق الداخلي السنوي.</w:t>
+      </w:r>
+    </w:p>
+    <w:p>
+      <w:pPr>
+        <w:pStyle w:val="ListeParagraf"/>
+        <w:bidi/>
+        <w:spacing w:after="80"/>
+        <w:ind w:left="0" w:right="709"/>
+        <w:jc w:val="both"/>
+      </w:pPr>
+    </w:p>
+    <w:p>
+      <w:pPr>
+        <w:pStyle w:val="ListeParagraf"/>
+        <w:bidi/>
+        <w:spacing w:before="120" w:after="60"/>
+        <w:ind w:left="0" w:right="709"/>
+      </w:pPr>
+      <w:r>
+        <w:rPr>
+          <w:rFonts w:ascii="Calibri" w:hAnsi="Calibri" w:cs="Arial"/>
+          <w:b/>
+          <w:bCs/>
+          <w:rtl/>
+          <w:sz w:val="24"/>
+          <w:szCs w:val="24"/>
+        </w:rPr>
+        <w:t xml:space="preserve">8. المتابعة والأداء</w:t>
+      </w:r>
+    </w:p>
+    <w:p>
+      <w:pPr>
+        <w:pStyle w:val="ListeParagraf"/>
+        <w:bidi/>
+        <w:spacing w:after="80"/>
+        <w:ind w:left="0" w:right="709"/>
+        <w:jc w:val="both"/>
+      </w:pPr>
+      <w:r>
+        <w:rPr>
+          <w:rFonts w:ascii="Calibri" w:hAnsi="Calibri" w:cs="Arial"/>
+          <w:rtl/>
+          <w:sz w:val="24"/>
+          <w:szCs w:val="24"/>
+        </w:rPr>
+        <w:t xml:space="preserve">8.1. يتابع منسق OCS المؤشرات التالية ويرفعها إلى الإدارة:</w:t>
       </w:r>
     </w:p>
     <w:p>
@@ -1554,1344 +2882,18 @@
           <w:ilvl w:val="0"/>
           <w:numId w:val="1"/>
         </w:numPr>
+        <w:bidi/>
         <w:spacing w:after="60"/>
         <w:jc w:val="both"/>
       </w:pPr>
       <w:r>
         <w:rPr>
           <w:rFonts w:ascii="Calibri" w:hAnsi="Calibri" w:cs="Arial"/>
-          <w:sz w:val="24"/>
-          <w:szCs w:val="24"/>
-        </w:rPr>
-        <w:t xml:space="preserve">EMS.DP.PRO.08.01. Material Receiving and Storage Procedure</w:t>
-      </w:r>
-    </w:p>
-    <w:p>
-      <w:pPr>
-        <w:pStyle w:val="ListeParagraf"/>
-        <w:spacing w:after="80"/>
-        <w:ind w:left="709" w:right="0"/>
-        <w:jc w:val="both"/>
-      </w:pPr>
-    </w:p>
-    <w:p>
-      <w:pPr>
-        <w:pStyle w:val="ListeParagraf"/>
-        <w:spacing w:before="120" w:after="60"/>
-        <w:ind w:left="709" w:right="0"/>
-      </w:pPr>
-      <w:r>
-        <w:rPr>
-          <w:rFonts w:ascii="Calibri" w:hAnsi="Calibri" w:cs="Arial"/>
-          <w:b/>
-          <w:bCs/>
-          <w:sz w:val="24"/>
-          <w:szCs w:val="24"/>
-        </w:rPr>
-        <w:t xml:space="preserve">10. FEEDBACK AND MONITORING</w:t>
-      </w:r>
-    </w:p>
-    <w:p>
-      <w:pPr>
-        <w:pStyle w:val="ListeParagraf"/>
-        <w:spacing w:after="80"/>
-        <w:ind w:left="709" w:right="0"/>
-        <w:jc w:val="both"/>
-      </w:pPr>
-      <w:r>
-        <w:rPr>
-          <w:rFonts w:ascii="Calibri" w:hAnsi="Calibri" w:cs="Arial"/>
-          <w:sz w:val="24"/>
-          <w:szCs w:val="24"/>
-        </w:rPr>
-        <w:t xml:space="preserve">This procedure is reviewed every year by the OCS Coordinator, or earlier when the OCS standard, customer requirements or the certificate scope change. Audit findings are evaluated and the procedure is revised when necessary.</w:t>
-      </w:r>
-    </w:p>
-    <w:p>
-      <w:r>
-        <w:br w:type="page"/>
-      </w:r>
-    </w:p>
-    <w:p>
-      <w:pPr>
-        <w:pStyle w:val="ListeParagraf"/>
-        <w:bidi/>
-        <w:spacing w:before="120" w:after="60"/>
-        <w:ind w:left="0" w:right="709"/>
-      </w:pPr>
-      <w:r>
-        <w:rPr>
-          <w:rFonts w:ascii="Calibri" w:hAnsi="Calibri" w:cs="Arial"/>
-          <w:b/>
-          <w:bCs/>
-          <w:rtl/>
-          <w:sz w:val="24"/>
-          <w:szCs w:val="24"/>
-        </w:rPr>
-        <w:t xml:space="preserve">الغرض</w:t>
-      </w:r>
-    </w:p>
-    <w:p>
-      <w:pPr>
-        <w:pStyle w:val="ListeParagraf"/>
-        <w:bidi/>
-        <w:spacing w:after="80"/>
-        <w:ind w:left="0" w:right="709"/>
-        <w:jc w:val="both"/>
-      </w:pPr>
-      <w:r>
-        <w:rPr>
-          <w:rFonts w:ascii="Calibri" w:hAnsi="Calibri" w:cs="Arial"/>
-          <w:rtl/>
-          <w:sz w:val="24"/>
-          <w:szCs w:val="24"/>
-        </w:rPr>
-        <w:t xml:space="preserve">يحدد هذا الإجراء كيفية استلام المواد العضوية المعتمدة وفق معيار GOTS أو OCS والتحقق منها وتمييزها وفصلها ومعالجتها وتتبعها من الاستلام حتى الشحن في شركة إيروغلو للتريكو (EMS)، بحيث يمكن إثبات المحتوى العضوي لكل منتج ومنع أي خلط أو تلوث.</w:t>
-      </w:r>
-    </w:p>
-    <w:p>
-      <w:pPr>
-        <w:pStyle w:val="ListeParagraf"/>
-        <w:bidi/>
-        <w:spacing w:after="80"/>
-        <w:ind w:left="0" w:right="709"/>
-        <w:jc w:val="both"/>
-      </w:pPr>
-    </w:p>
-    <w:p>
-      <w:pPr>
-        <w:pStyle w:val="ListeParagraf"/>
-        <w:bidi/>
-        <w:spacing w:before="120" w:after="60"/>
-        <w:ind w:left="0" w:right="709"/>
-      </w:pPr>
-      <w:r>
-        <w:rPr>
-          <w:rFonts w:ascii="Calibri" w:hAnsi="Calibri" w:cs="Arial"/>
-          <w:b/>
-          <w:bCs/>
-          <w:rtl/>
-          <w:sz w:val="24"/>
-          <w:szCs w:val="24"/>
-        </w:rPr>
-        <w:t xml:space="preserve">النطاق</w:t>
-      </w:r>
-    </w:p>
-    <w:p>
-      <w:pPr>
-        <w:pStyle w:val="ListeParagraf"/>
-        <w:bidi/>
-        <w:spacing w:after="80"/>
-        <w:ind w:left="0" w:right="709"/>
-        <w:jc w:val="both"/>
-      </w:pPr>
-      <w:r>
-        <w:rPr>
-          <w:rFonts w:ascii="Calibri" w:hAnsi="Calibri" w:cs="Arial"/>
-          <w:rtl/>
-          <w:sz w:val="24"/>
-          <w:szCs w:val="24"/>
-        </w:rPr>
-        <w:t xml:space="preserve">يشمل هذا الإجراء جميع الخيوط والأقمشة والإكسسوارات العضوية التي يُدّعى أنها وفق معيار GOTS أو OCS، بدءًا من الشراء والاستلام مرورًا بالتريكو والصباغة والتجهيز والقص والخياطة والتعبئة والتصنيع لدى الغير وحتى الشحن.</w:t>
-      </w:r>
-    </w:p>
-    <w:p>
-      <w:pPr>
-        <w:pStyle w:val="ListeParagraf"/>
-        <w:bidi/>
-        <w:spacing w:after="80"/>
-        <w:ind w:left="0" w:right="709"/>
-        <w:jc w:val="both"/>
-      </w:pPr>
-    </w:p>
-    <w:p>
-      <w:pPr>
-        <w:pStyle w:val="ListeParagraf"/>
-        <w:bidi/>
-        <w:spacing w:before="120" w:after="60"/>
-        <w:ind w:left="0" w:right="709"/>
-      </w:pPr>
-      <w:r>
-        <w:rPr>
-          <w:rFonts w:ascii="Calibri" w:hAnsi="Calibri" w:cs="Arial"/>
-          <w:b/>
-          <w:bCs/>
-          <w:rtl/>
-          <w:sz w:val="24"/>
-          <w:szCs w:val="24"/>
-        </w:rPr>
-        <w:t xml:space="preserve">المسؤوليات</w:t>
-      </w:r>
-    </w:p>
-    <w:p>
-      <w:pPr>
-        <w:pStyle w:val="ListeParagraf"/>
-        <w:bidi/>
-        <w:spacing w:after="80"/>
-        <w:ind w:left="0" w:right="709"/>
-        <w:jc w:val="both"/>
-      </w:pPr>
-      <w:r>
-        <w:rPr>
-          <w:rFonts w:ascii="Calibri" w:hAnsi="Calibri" w:cs="Arial"/>
-          <w:rtl/>
-          <w:sz w:val="24"/>
-          <w:szCs w:val="24"/>
-        </w:rPr>
-        <w:t xml:space="preserve">• </w:t>
-      </w:r>
-      <w:r>
-        <w:rPr>
-          <w:rFonts w:ascii="Calibri" w:hAnsi="Calibri" w:cs="Arial"/>
-          <w:b/>
-          <w:bCs/>
-          <w:rtl/>
-          <w:sz w:val="24"/>
-          <w:szCs w:val="24"/>
-        </w:rPr>
-        <w:t xml:space="preserve">منسق OCS:</w:t>
-      </w:r>
-      <w:r>
-        <w:rPr>
-          <w:rFonts w:ascii="Calibri" w:hAnsi="Calibri" w:cs="Arial"/>
-          <w:rtl/>
-          <w:sz w:val="24"/>
-          <w:szCs w:val="24"/>
-        </w:rPr>
-        <w:t xml:space="preserve"> يتحقق من شهادات الموردين وشهادات المعاملات الواردة، ويحتفظ بسجلات التتبع وموازنة الكميات، ويطلب شهادات المعاملات الصادرة.</w:t>
-      </w:r>
-    </w:p>
-    <w:p>
-      <w:pPr>
-        <w:pStyle w:val="ListeParagraf"/>
-        <w:bidi/>
-        <w:spacing w:after="80"/>
-        <w:ind w:left="0" w:right="709"/>
-        <w:jc w:val="both"/>
-      </w:pPr>
-      <w:r>
-        <w:rPr>
-          <w:rFonts w:ascii="Calibri" w:hAnsi="Calibri" w:cs="Arial"/>
-          <w:rtl/>
-          <w:sz w:val="24"/>
-          <w:szCs w:val="24"/>
-        </w:rPr>
-        <w:t xml:space="preserve">• </w:t>
-      </w:r>
-      <w:r>
-        <w:rPr>
-          <w:rFonts w:ascii="Calibri" w:hAnsi="Calibri" w:cs="Arial"/>
-          <w:b/>
-          <w:bCs/>
-          <w:rtl/>
-          <w:sz w:val="24"/>
-          <w:szCs w:val="24"/>
-        </w:rPr>
-        <w:t xml:space="preserve">مشرف المستودع:</w:t>
-      </w:r>
-      <w:r>
-        <w:rPr>
-          <w:rFonts w:ascii="Calibri" w:hAnsi="Calibri" w:cs="Arial"/>
-          <w:rtl/>
-          <w:sz w:val="24"/>
-          <w:szCs w:val="24"/>
-        </w:rPr>
-        <w:t xml:space="preserve"> يستلم مواد OCS ويضع عليها الملصقات ويخزنها في المنطقة المخصصة ويسجل جميع حركاتها.</w:t>
-      </w:r>
-    </w:p>
-    <w:p>
-      <w:pPr>
-        <w:pStyle w:val="ListeParagraf"/>
-        <w:bidi/>
-        <w:spacing w:after="80"/>
-        <w:ind w:left="0" w:right="709"/>
-        <w:jc w:val="both"/>
-      </w:pPr>
-      <w:r>
-        <w:rPr>
-          <w:rFonts w:ascii="Calibri" w:hAnsi="Calibri" w:cs="Arial"/>
-          <w:rtl/>
-          <w:sz w:val="24"/>
-          <w:szCs w:val="24"/>
-        </w:rPr>
-        <w:t xml:space="preserve">• </w:t>
-      </w:r>
-      <w:r>
-        <w:rPr>
-          <w:rFonts w:ascii="Calibri" w:hAnsi="Calibri" w:cs="Arial"/>
-          <w:b/>
-          <w:bCs/>
-          <w:rtl/>
-          <w:sz w:val="24"/>
-          <w:szCs w:val="24"/>
-        </w:rPr>
-        <w:t xml:space="preserve">تخطيط الإنتاج ومشرفو الأقسام:</w:t>
-      </w:r>
-      <w:r>
-        <w:rPr>
-          <w:rFonts w:ascii="Calibri" w:hAnsi="Calibri" w:cs="Arial"/>
-          <w:rtl/>
-          <w:sz w:val="24"/>
-          <w:szCs w:val="24"/>
-        </w:rPr>
-        <w:t xml:space="preserve"> يخططون طلبيات OCS بشكل منفصل، ويحافظون على تمييز مواد OCS أثناء المعالجة، ويسجلون الكميات والفاقد وأرقام الدفعات.</w:t>
-      </w:r>
-    </w:p>
-    <w:p>
-      <w:pPr>
-        <w:pStyle w:val="ListeParagraf"/>
-        <w:bidi/>
-        <w:spacing w:after="80"/>
-        <w:ind w:left="0" w:right="709"/>
-        <w:jc w:val="both"/>
-      </w:pPr>
-      <w:r>
-        <w:rPr>
-          <w:rFonts w:ascii="Calibri" w:hAnsi="Calibri" w:cs="Arial"/>
-          <w:rtl/>
-          <w:sz w:val="24"/>
-          <w:szCs w:val="24"/>
-        </w:rPr>
-        <w:t xml:space="preserve">• </w:t>
-      </w:r>
-      <w:r>
-        <w:rPr>
-          <w:rFonts w:ascii="Calibri" w:hAnsi="Calibri" w:cs="Arial"/>
-          <w:b/>
-          <w:bCs/>
-          <w:rtl/>
-          <w:sz w:val="24"/>
-          <w:szCs w:val="24"/>
-        </w:rPr>
-        <w:t xml:space="preserve">ضمان الجودة:</w:t>
-      </w:r>
-      <w:r>
-        <w:rPr>
-          <w:rFonts w:ascii="Calibri" w:hAnsi="Calibri" w:cs="Arial"/>
-          <w:rtl/>
-          <w:sz w:val="24"/>
-          <w:szCs w:val="24"/>
-        </w:rPr>
-        <w:t xml:space="preserve"> يتحقق من الفصل والتوسيم أثناء الفحص على خط الإنتاج وقبل الشحن.</w:t>
-      </w:r>
-    </w:p>
-    <w:p>
-      <w:pPr>
-        <w:pStyle w:val="ListeParagraf"/>
-        <w:bidi/>
-        <w:spacing w:after="80"/>
-        <w:ind w:left="0" w:right="709"/>
-        <w:jc w:val="both"/>
-      </w:pPr>
-    </w:p>
-    <w:p>
-      <w:pPr>
-        <w:pStyle w:val="ListeParagraf"/>
-        <w:bidi/>
-        <w:spacing w:before="120" w:after="60"/>
-        <w:ind w:left="0" w:right="709"/>
-      </w:pPr>
-      <w:r>
-        <w:rPr>
-          <w:rFonts w:ascii="Calibri" w:hAnsi="Calibri" w:cs="Arial"/>
-          <w:b/>
-          <w:bCs/>
-          <w:rtl/>
-          <w:sz w:val="24"/>
-          <w:szCs w:val="24"/>
-        </w:rPr>
-        <w:t xml:space="preserve">التعريفات</w:t>
-      </w:r>
-    </w:p>
-    <w:p>
-      <w:pPr>
-        <w:pStyle w:val="ListeParagraf"/>
-        <w:bidi/>
-        <w:spacing w:after="80"/>
-        <w:ind w:left="0" w:right="709"/>
-        <w:jc w:val="both"/>
-      </w:pPr>
-      <w:r>
-        <w:rPr>
-          <w:rFonts w:ascii="Calibri" w:hAnsi="Calibri" w:cs="Arial"/>
-          <w:rtl/>
-          <w:sz w:val="24"/>
-          <w:szCs w:val="24"/>
-        </w:rPr>
-        <w:t xml:space="preserve">• </w:t>
-      </w:r>
-      <w:r>
-        <w:rPr>
-          <w:rFonts w:ascii="Calibri" w:hAnsi="Calibri" w:cs="Arial"/>
-          <w:b/>
-          <w:bCs/>
-          <w:rtl/>
-          <w:sz w:val="24"/>
-          <w:szCs w:val="24"/>
-        </w:rPr>
-        <w:t xml:space="preserve">شهادة المعاملة الواردة:</w:t>
-      </w:r>
-      <w:r>
-        <w:rPr>
-          <w:rFonts w:ascii="Calibri" w:hAnsi="Calibri" w:cs="Arial"/>
-          <w:rtl/>
-          <w:sz w:val="24"/>
-          <w:szCs w:val="24"/>
-        </w:rPr>
-        <w:t xml:space="preserve"> شهادة المعاملة المستلمة من المورد للمواد العضوية الموردة إلى EMS.</w:t>
-      </w:r>
-    </w:p>
-    <w:p>
-      <w:pPr>
-        <w:pStyle w:val="ListeParagraf"/>
-        <w:bidi/>
-        <w:spacing w:after="80"/>
-        <w:ind w:left="0" w:right="709"/>
-        <w:jc w:val="both"/>
-      </w:pPr>
-      <w:r>
-        <w:rPr>
-          <w:rFonts w:ascii="Calibri" w:hAnsi="Calibri" w:cs="Arial"/>
-          <w:rtl/>
-          <w:sz w:val="24"/>
-          <w:szCs w:val="24"/>
-        </w:rPr>
-        <w:t xml:space="preserve">• </w:t>
-      </w:r>
-      <w:r>
-        <w:rPr>
-          <w:rFonts w:ascii="Calibri" w:hAnsi="Calibri" w:cs="Arial"/>
-          <w:b/>
-          <w:bCs/>
-          <w:rtl/>
-          <w:sz w:val="24"/>
-          <w:szCs w:val="24"/>
-        </w:rPr>
-        <w:t xml:space="preserve">موازنة الكميات:</w:t>
-      </w:r>
-      <w:r>
-        <w:rPr>
-          <w:rFonts w:ascii="Calibri" w:hAnsi="Calibri" w:cs="Arial"/>
-          <w:rtl/>
-          <w:sz w:val="24"/>
-          <w:szCs w:val="24"/>
-        </w:rPr>
-        <w:t xml:space="preserve"> مقارنة كمية المدخلات المعتمدة بكمية المخرجات المعتمدة وفاقد العمليات لطلبية أو لفترة معينة.</w:t>
-      </w:r>
-    </w:p>
-    <w:p>
-      <w:pPr>
-        <w:pStyle w:val="ListeParagraf"/>
-        <w:bidi/>
-        <w:spacing w:after="80"/>
-        <w:ind w:left="0" w:right="709"/>
-        <w:jc w:val="both"/>
-      </w:pPr>
-      <w:r>
-        <w:rPr>
-          <w:rFonts w:ascii="Calibri" w:hAnsi="Calibri" w:cs="Arial"/>
-          <w:rtl/>
-          <w:sz w:val="24"/>
-          <w:szCs w:val="24"/>
-        </w:rPr>
-        <w:t xml:space="preserve">• </w:t>
-      </w:r>
-      <w:r>
-        <w:rPr>
-          <w:rFonts w:ascii="Calibri" w:hAnsi="Calibri" w:cs="Arial"/>
-          <w:b/>
-          <w:bCs/>
-          <w:rtl/>
-          <w:sz w:val="24"/>
-          <w:szCs w:val="24"/>
-        </w:rPr>
-        <w:t xml:space="preserve">دفعة OCS:</w:t>
-      </w:r>
-      <w:r>
-        <w:rPr>
-          <w:rFonts w:ascii="Calibri" w:hAnsi="Calibri" w:cs="Arial"/>
-          <w:rtl/>
-          <w:sz w:val="24"/>
-          <w:szCs w:val="24"/>
-        </w:rPr>
-        <w:t xml:space="preserve"> كمية محددة من المواد العضوية لها رقم تعريف خاص بها ومرتبطة بشهادة المعاملة الواردة الخاصة بها.</w:t>
-      </w:r>
-    </w:p>
-    <w:p>
-      <w:pPr>
-        <w:pStyle w:val="ListeParagraf"/>
-        <w:bidi/>
-        <w:spacing w:after="80"/>
-        <w:ind w:left="0" w:right="709"/>
-        <w:jc w:val="both"/>
-      </w:pPr>
-      <w:r>
-        <w:rPr>
-          <w:rFonts w:ascii="Calibri" w:hAnsi="Calibri" w:cs="Arial"/>
-          <w:rtl/>
-          <w:sz w:val="24"/>
-          <w:szCs w:val="24"/>
-        </w:rPr>
-        <w:t xml:space="preserve">• </w:t>
-      </w:r>
-      <w:r>
-        <w:rPr>
-          <w:rFonts w:ascii="Calibri" w:hAnsi="Calibri" w:cs="Arial"/>
-          <w:b/>
-          <w:bCs/>
-          <w:rtl/>
-          <w:sz w:val="24"/>
-          <w:szCs w:val="24"/>
-        </w:rPr>
-        <w:t xml:space="preserve">منسق OCS:</w:t>
-      </w:r>
-      <w:r>
-        <w:rPr>
-          <w:rFonts w:ascii="Calibri" w:hAnsi="Calibri" w:cs="Arial"/>
-          <w:rtl/>
-          <w:sz w:val="24"/>
-          <w:szCs w:val="24"/>
-        </w:rPr>
-        <w:t xml:space="preserve"> الشخص المسؤول عن النظام العضوي. ويعمل أيضًا كمنسق GOTS عند معالجة طلبيات GOTS، وتنطبق القواعد نفسها على دفعات GOTS.</w:t>
-      </w:r>
-    </w:p>
-    <w:p>
-      <w:pPr>
-        <w:pStyle w:val="ListeParagraf"/>
-        <w:bidi/>
-        <w:spacing w:after="80"/>
-        <w:ind w:left="0" w:right="709"/>
-        <w:jc w:val="both"/>
-      </w:pPr>
-      <w:r>
-        <w:rPr>
-          <w:rFonts w:ascii="Calibri" w:hAnsi="Calibri" w:cs="Arial"/>
-          <w:rtl/>
-          <w:sz w:val="24"/>
-          <w:szCs w:val="24"/>
-        </w:rPr>
-        <w:t xml:space="preserve">• </w:t>
-      </w:r>
-      <w:r>
-        <w:rPr>
-          <w:rFonts w:ascii="Calibri" w:hAnsi="Calibri" w:cs="Arial"/>
-          <w:b/>
-          <w:bCs/>
-          <w:rtl/>
-          <w:sz w:val="24"/>
-          <w:szCs w:val="24"/>
-        </w:rPr>
-        <w:t xml:space="preserve">نظام الألوان:</w:t>
-      </w:r>
-      <w:r>
-        <w:rPr>
-          <w:rFonts w:ascii="Calibri" w:hAnsi="Calibri" w:cs="Arial"/>
-          <w:rtl/>
-          <w:sz w:val="24"/>
-          <w:szCs w:val="24"/>
-        </w:rPr>
-        <w:t xml:space="preserve"> أخضر = منطقة منتج عضوي، أزرق = منطقة تقليدية، أصفر = منطقة انتظار أو حجر، أحمر = منطقة غير مطابقة أو محظورة (انظر EMS.OR.PRO.21.02).</w:t>
-      </w:r>
-    </w:p>
-    <w:p>
-      <w:pPr>
-        <w:pStyle w:val="ListeParagraf"/>
-        <w:bidi/>
-        <w:spacing w:after="80"/>
-        <w:ind w:left="0" w:right="709"/>
-        <w:jc w:val="both"/>
-      </w:pPr>
-    </w:p>
-    <w:p>
-      <w:pPr>
-        <w:pStyle w:val="ListeParagraf"/>
-        <w:bidi/>
-        <w:spacing w:before="120" w:after="60"/>
-        <w:ind w:left="0" w:right="709"/>
-      </w:pPr>
-      <w:r>
-        <w:rPr>
-          <w:rFonts w:ascii="Calibri" w:hAnsi="Calibri" w:cs="Arial"/>
-          <w:b/>
-          <w:bCs/>
-          <w:rtl/>
-          <w:sz w:val="24"/>
-          <w:szCs w:val="24"/>
-        </w:rPr>
-        <w:t xml:space="preserve">العمليات الرئيسية والفرعية</w:t>
-      </w:r>
-    </w:p>
-    <w:p>
-      <w:pPr>
-        <w:pStyle w:val="ListeParagraf"/>
-        <w:bidi/>
-        <w:spacing w:before="120" w:after="60"/>
-        <w:ind w:left="0" w:right="709"/>
-      </w:pPr>
-      <w:r>
-        <w:rPr>
-          <w:rFonts w:ascii="Calibri" w:hAnsi="Calibri" w:cs="Arial"/>
-          <w:b/>
-          <w:bCs/>
-          <w:rtl/>
-          <w:sz w:val="24"/>
-          <w:szCs w:val="24"/>
-        </w:rPr>
-        <w:t xml:space="preserve">1. الشراء والتحقق من الموردين</w:t>
-      </w:r>
-    </w:p>
-    <w:p>
-      <w:pPr>
-        <w:pStyle w:val="ListeParagraf"/>
-        <w:bidi/>
-        <w:spacing w:after="80"/>
-        <w:ind w:left="0" w:right="709"/>
-        <w:jc w:val="both"/>
-      </w:pPr>
-      <w:r>
-        <w:rPr>
-          <w:rFonts w:ascii="Calibri" w:hAnsi="Calibri" w:cs="Arial"/>
-          <w:rtl/>
-          <w:sz w:val="24"/>
-          <w:szCs w:val="24"/>
-        </w:rPr>
-        <w:t xml:space="preserve">1.1. لا تُطلب المواد العضوية إلا من موردين لديهم شهادة نطاق GOTS أو OCS سارية تغطي المنتج؛ ويتحقق منسق OCS من الشهادة في قاعدة بيانات الشهادات العامة قبل إصدار الطلب.</w:t>
-      </w:r>
-    </w:p>
-    <w:p>
-      <w:pPr>
-        <w:pStyle w:val="ListeParagraf"/>
-        <w:bidi/>
-        <w:spacing w:after="80"/>
-        <w:ind w:left="0" w:right="709"/>
-        <w:jc w:val="both"/>
-      </w:pPr>
-      <w:r>
-        <w:rPr>
-          <w:rFonts w:ascii="Calibri" w:hAnsi="Calibri" w:cs="Arial"/>
-          <w:rtl/>
-          <w:sz w:val="24"/>
-          <w:szCs w:val="24"/>
-        </w:rPr>
-        <w:t xml:space="preserve">1.2. ينص أمر الشراء بوضوح على «OCS 100» أو «OCS Blended» ونسبة المحتوى العضوي وضرورة تقديم شهادة معاملة.</w:t>
-      </w:r>
-    </w:p>
-    <w:p>
-      <w:pPr>
-        <w:pStyle w:val="ListeParagraf"/>
-        <w:bidi/>
-        <w:spacing w:after="80"/>
-        <w:ind w:left="0" w:right="709"/>
-        <w:jc w:val="both"/>
-      </w:pPr>
-    </w:p>
-    <w:p>
-      <w:pPr>
-        <w:pStyle w:val="ListeParagraf"/>
-        <w:bidi/>
-        <w:spacing w:before="120" w:after="60"/>
-        <w:ind w:left="0" w:right="709"/>
-      </w:pPr>
-      <w:r>
-        <w:rPr>
-          <w:rFonts w:ascii="Calibri" w:hAnsi="Calibri" w:cs="Arial"/>
-          <w:b/>
-          <w:bCs/>
-          <w:rtl/>
-          <w:sz w:val="24"/>
-          <w:szCs w:val="24"/>
-        </w:rPr>
-        <w:t xml:space="preserve">2. الاستلام والتحقق</w:t>
-      </w:r>
-    </w:p>
-    <w:p>
-      <w:pPr>
-        <w:pStyle w:val="ListeParagraf"/>
-        <w:bidi/>
-        <w:spacing w:after="80"/>
-        <w:ind w:left="0" w:right="709"/>
-        <w:jc w:val="both"/>
-      </w:pPr>
-      <w:r>
-        <w:rPr>
-          <w:rFonts w:ascii="Calibri" w:hAnsi="Calibri" w:cs="Arial"/>
-          <w:rtl/>
-          <w:sz w:val="24"/>
-          <w:szCs w:val="24"/>
-        </w:rPr>
-        <w:t xml:space="preserve">2.1. عند الاستلام يتحقق المستودع من إذن التسليم والفاتورة وقائمة التعبئة، ومن أن العبوات موسومة كمواد عضوية.</w:t>
-      </w:r>
-    </w:p>
-    <w:p>
-      <w:pPr>
-        <w:pStyle w:val="ListeParagraf"/>
-        <w:bidi/>
-        <w:spacing w:after="80"/>
-        <w:ind w:left="0" w:right="709"/>
-        <w:jc w:val="both"/>
-      </w:pPr>
-      <w:r>
-        <w:rPr>
-          <w:rFonts w:ascii="Calibri" w:hAnsi="Calibri" w:cs="Arial"/>
-          <w:rtl/>
-          <w:sz w:val="24"/>
-          <w:szCs w:val="24"/>
-        </w:rPr>
-        <w:t xml:space="preserve">2.2. يتحقق منسق OCS من أن الكميات ووصف المنتج والبائع والمشتري الواردة في شهادة المعاملة الواردة (أو بيانات الشحنة المرسلة لإصدار الشهادة) تطابق التوريد.</w:t>
-      </w:r>
-    </w:p>
-    <w:p>
-      <w:pPr>
-        <w:pStyle w:val="ListeParagraf"/>
-        <w:bidi/>
-        <w:spacing w:after="80"/>
-        <w:ind w:left="0" w:right="709"/>
-        <w:jc w:val="both"/>
-      </w:pPr>
-      <w:r>
-        <w:rPr>
-          <w:rFonts w:ascii="Calibri" w:hAnsi="Calibri" w:cs="Arial"/>
-          <w:rtl/>
-          <w:sz w:val="24"/>
-          <w:szCs w:val="24"/>
-        </w:rPr>
-        <w:t xml:space="preserve">2.3. تُوقف المواد التي لا تتطابق وثائقها في منطقة الحجر، ولا تُستخدم كمواد عضوية حتى تُحل المشكلة.</w:t>
-      </w:r>
-    </w:p>
-    <w:p>
-      <w:pPr>
-        <w:pStyle w:val="ListeParagraf"/>
-        <w:bidi/>
-        <w:spacing w:after="80"/>
-        <w:ind w:left="0" w:right="709"/>
-        <w:jc w:val="both"/>
-      </w:pPr>
-    </w:p>
-    <w:p>
-      <w:pPr>
-        <w:pStyle w:val="ListeParagraf"/>
-        <w:bidi/>
-        <w:spacing w:before="120" w:after="60"/>
-        <w:ind w:left="0" w:right="709"/>
-      </w:pPr>
-      <w:r>
-        <w:rPr>
-          <w:rFonts w:ascii="Calibri" w:hAnsi="Calibri" w:cs="Arial"/>
-          <w:b/>
-          <w:bCs/>
-          <w:rtl/>
-          <w:sz w:val="24"/>
-          <w:szCs w:val="24"/>
-        </w:rPr>
-        <w:t xml:space="preserve">3. التمييز والفصل</w:t>
-      </w:r>
-    </w:p>
-    <w:p>
-      <w:pPr>
-        <w:pStyle w:val="ListeParagraf"/>
-        <w:bidi/>
-        <w:spacing w:after="80"/>
-        <w:ind w:left="0" w:right="709"/>
-        <w:jc w:val="both"/>
-      </w:pPr>
-      <w:r>
-        <w:rPr>
-          <w:rFonts w:ascii="Calibri" w:hAnsi="Calibri" w:cs="Arial"/>
-          <w:rtl/>
-          <w:sz w:val="24"/>
-          <w:szCs w:val="24"/>
-        </w:rPr>
-        <w:t xml:space="preserve">3.1. تُعطى كل دفعة OCS رقم دفعة وملصقًا أخضر «OCS – عضوي» يبين رقم الدفعة والمورد والكمية ورقم شهادة المعاملة.</w:t>
-      </w:r>
-    </w:p>
-    <w:p>
-      <w:pPr>
-        <w:pStyle w:val="ListeParagraf"/>
-        <w:bidi/>
-        <w:spacing w:after="80"/>
-        <w:ind w:left="0" w:right="709"/>
-        <w:jc w:val="both"/>
-      </w:pPr>
-      <w:r>
-        <w:rPr>
-          <w:rFonts w:ascii="Calibri" w:hAnsi="Calibri" w:cs="Arial"/>
-          <w:rtl/>
-          <w:sz w:val="24"/>
-          <w:szCs w:val="24"/>
-        </w:rPr>
-        <w:t xml:space="preserve">3.2. تُخزن مواد OCS في منطقة أو رف منفصل ومحدد بوضوح، ولا تُخزن أبدًا على نفس المنصة أو في نفس الصندوق مع المواد التقليدية.</w:t>
-      </w:r>
-    </w:p>
-    <w:p>
-      <w:pPr>
-        <w:pStyle w:val="ListeParagraf"/>
-        <w:bidi/>
-        <w:spacing w:after="80"/>
-        <w:ind w:left="0" w:right="709"/>
-        <w:jc w:val="both"/>
-      </w:pPr>
-      <w:r>
-        <w:rPr>
-          <w:rFonts w:ascii="Calibri" w:hAnsi="Calibri" w:cs="Arial"/>
-          <w:rtl/>
-          <w:sz w:val="24"/>
-          <w:szCs w:val="24"/>
-        </w:rPr>
-        <w:t xml:space="preserve">3.3. قبل بدء طلبية OCS تُنظف الآلات وطاولات القص وخطوط الخياطة، ويُنفذ تفريغ الخط ويُسجل.</w:t>
-      </w:r>
-    </w:p>
-    <w:p>
-      <w:pPr>
-        <w:pStyle w:val="ListeParagraf"/>
-        <w:bidi/>
-        <w:spacing w:after="80"/>
-        <w:ind w:left="0" w:right="709"/>
-        <w:jc w:val="both"/>
-      </w:pPr>
-      <w:r>
-        <w:rPr>
-          <w:rFonts w:ascii="Calibri" w:hAnsi="Calibri" w:cs="Arial"/>
-          <w:rtl/>
-          <w:sz w:val="24"/>
-          <w:szCs w:val="24"/>
-        </w:rPr>
-        <w:t xml:space="preserve">3.4. تحمل المنتجات قيد التصنيع والقطع المقصوصة والمنتجات النهائية علامات تمييز OCS (ملصقات أو بطاقات حزم ملونة أو بطاقات تعريف) في كل مرحلة.</w:t>
-      </w:r>
-    </w:p>
-    <w:p>
-      <w:pPr>
-        <w:pStyle w:val="ListeParagraf"/>
-        <w:bidi/>
-        <w:spacing w:after="80"/>
-        <w:ind w:left="0" w:right="709"/>
-        <w:jc w:val="both"/>
-      </w:pPr>
-      <w:r>
-        <w:rPr>
-          <w:rFonts w:ascii="Calibri" w:hAnsi="Calibri" w:cs="Arial"/>
-          <w:rtl/>
-          <w:sz w:val="24"/>
-          <w:szCs w:val="24"/>
-        </w:rPr>
-        <w:t xml:space="preserve">3.5. تُعالج طلبيات OCS قدر الإمكان في دفعات منفصلة أو في بداية الوردية؛ ولا يُسمح بالتحميل المختلط مع المواد التقليدية.</w:t>
-      </w:r>
-    </w:p>
-    <w:p>
-      <w:pPr>
-        <w:pStyle w:val="ListeParagraf"/>
-        <w:bidi/>
-        <w:spacing w:after="80"/>
-        <w:ind w:left="0" w:right="709"/>
-        <w:jc w:val="both"/>
-      </w:pPr>
-      <w:r>
-        <w:rPr>
-          <w:rFonts w:ascii="Calibri" w:hAnsi="Calibri" w:cs="Arial"/>
-          <w:rtl/>
-          <w:sz w:val="24"/>
-          <w:szCs w:val="24"/>
-        </w:rPr>
-        <w:t xml:space="preserve">3.6. تُحدد مناطق الإنتاج العضوي ونظام ألوانها ولافتاتها وقواعد الدخول إليها في EMS.OR.PRO.21.02؛ وتُبيَّن طريقة التنظيف عند التبديل وتفريغ الخط في EMS.OR.TL.21.02 وتُسجل في سجل التبديل وتفريغ الخط (EMS.OR.FRM.21.03).</w:t>
-      </w:r>
-    </w:p>
-    <w:p>
-      <w:pPr>
-        <w:pStyle w:val="ListeParagraf"/>
-        <w:bidi/>
-        <w:spacing w:after="80"/>
-        <w:ind w:left="0" w:right="709"/>
-        <w:jc w:val="both"/>
-      </w:pPr>
-      <w:r>
-        <w:rPr>
-          <w:rFonts w:ascii="Calibri" w:hAnsi="Calibri" w:cs="Arial"/>
-          <w:rtl/>
-          <w:sz w:val="24"/>
-          <w:szCs w:val="24"/>
-        </w:rPr>
-        <w:t xml:space="preserve">3.7. تُنقل المواد غير الموسومة أو المشكوك فيها أو المنتظرة للقرار إلى منطقة انتظار صفراء؛ وتُنقل المواد غير المطابقة إلى منطقة حمراء محظورة ولا تُستخدم أبدًا كمواد عضوية.</w:t>
-      </w:r>
-    </w:p>
-    <w:p>
-      <w:pPr>
-        <w:pStyle w:val="ListeParagraf"/>
-        <w:bidi/>
-        <w:spacing w:after="80"/>
-        <w:ind w:left="0" w:right="709"/>
-        <w:jc w:val="both"/>
-      </w:pPr>
-    </w:p>
-    <w:p>
-      <w:pPr>
-        <w:pStyle w:val="ListeParagraf"/>
-        <w:bidi/>
-        <w:spacing w:before="120" w:after="60"/>
-        <w:ind w:left="0" w:right="709"/>
-      </w:pPr>
-      <w:r>
-        <w:rPr>
-          <w:rFonts w:ascii="Calibri" w:hAnsi="Calibri" w:cs="Arial"/>
-          <w:b/>
-          <w:bCs/>
-          <w:rtl/>
-          <w:sz w:val="24"/>
-          <w:szCs w:val="24"/>
-        </w:rPr>
-        <w:t xml:space="preserve">4. التتبع وموازنة الكميات</w:t>
-      </w:r>
-    </w:p>
-    <w:p>
-      <w:pPr>
-        <w:pStyle w:val="ListeParagraf"/>
-        <w:bidi/>
-        <w:spacing w:after="80"/>
-        <w:ind w:left="0" w:right="709"/>
-        <w:jc w:val="both"/>
-      </w:pPr>
-      <w:r>
-        <w:rPr>
-          <w:rFonts w:ascii="Calibri" w:hAnsi="Calibri" w:cs="Arial"/>
-          <w:rtl/>
-          <w:sz w:val="24"/>
-          <w:szCs w:val="24"/>
-        </w:rPr>
-        <w:t xml:space="preserve">4.1. لكل طلبية OCS تربط سجلات الإنتاج رقم دفعة المدخلات وشهادة المعاملة بسجلات التريكو ودفعة الصباغة والقص والخياطة والتعبئة.</w:t>
-      </w:r>
-    </w:p>
-    <w:p>
-      <w:pPr>
-        <w:pStyle w:val="ListeParagraf"/>
-        <w:bidi/>
-        <w:spacing w:after="80"/>
-        <w:ind w:left="0" w:right="709"/>
-        <w:jc w:val="both"/>
-      </w:pPr>
-      <w:r>
-        <w:rPr>
-          <w:rFonts w:ascii="Calibri" w:hAnsi="Calibri" w:cs="Arial"/>
-          <w:rtl/>
-          <w:sz w:val="24"/>
-          <w:szCs w:val="24"/>
-        </w:rPr>
-        <w:t xml:space="preserve">4.2. تُسجل كميات المدخلات والمخرجات والفاقد والمرفوضات في كل مرحلة، باستخدام معاملات تحويل يعتمدها منسق OCS.</w:t>
-      </w:r>
-    </w:p>
-    <w:p>
-      <w:pPr>
-        <w:pStyle w:val="ListeParagraf"/>
-        <w:bidi/>
-        <w:spacing w:after="80"/>
-        <w:ind w:left="0" w:right="709"/>
-        <w:jc w:val="both"/>
-      </w:pPr>
-      <w:r>
-        <w:rPr>
-          <w:rFonts w:ascii="Calibri" w:hAnsi="Calibri" w:cs="Arial"/>
-          <w:rtl/>
-          <w:sz w:val="24"/>
-          <w:szCs w:val="24"/>
-        </w:rPr>
-        <w:t xml:space="preserve">4.3. تُجرى موازنة الكميات لكل طلبية وتُلخص كل ربع سنة؛ ولا يجوز أبدًا أن تتجاوز المخرجات المُدّعى أنها عضوية كمية المدخلات المعتمدة مطروحًا منها فاقد العمليات.</w:t>
-      </w:r>
-    </w:p>
-    <w:p>
-      <w:pPr>
-        <w:pStyle w:val="ListeParagraf"/>
-        <w:bidi/>
-        <w:spacing w:after="80"/>
-        <w:ind w:left="0" w:right="709"/>
-        <w:jc w:val="both"/>
-      </w:pPr>
-      <w:r>
-        <w:rPr>
-          <w:rFonts w:ascii="Calibri" w:hAnsi="Calibri" w:cs="Arial"/>
-          <w:rtl/>
-          <w:sz w:val="24"/>
-          <w:szCs w:val="24"/>
-        </w:rPr>
-        <w:t xml:space="preserve">4.4. تُحفظ النفايات والقصاصات العضوية منفصلة وتُسجل.</w:t>
-      </w:r>
-    </w:p>
-    <w:p>
-      <w:pPr>
-        <w:pStyle w:val="ListeParagraf"/>
-        <w:bidi/>
-        <w:spacing w:after="80"/>
-        <w:ind w:left="0" w:right="709"/>
-        <w:jc w:val="both"/>
-      </w:pPr>
-      <w:r>
-        <w:rPr>
-          <w:rFonts w:ascii="Calibri" w:hAnsi="Calibri" w:cs="Arial"/>
-          <w:rtl/>
-          <w:sz w:val="24"/>
-          <w:szCs w:val="24"/>
-        </w:rPr>
-        <w:t xml:space="preserve">4.5. تُسجل موازنة الكميات في سجل موازنة الكتلة العضوية (EMS.OR.FRM.21.04). وتُدرج كل دفعة في سجل تتبع الدفعات العضوية (EMS.OR.FRM.21.02) عند صرفها للإنتاج.</w:t>
-      </w:r>
-    </w:p>
-    <w:p>
-      <w:pPr>
-        <w:pStyle w:val="ListeParagraf"/>
-        <w:bidi/>
-        <w:spacing w:after="80"/>
-        <w:ind w:left="0" w:right="709"/>
-        <w:jc w:val="both"/>
-      </w:pPr>
-      <w:r>
-        <w:rPr>
-          <w:rFonts w:ascii="Calibri" w:hAnsi="Calibri" w:cs="Arial"/>
-          <w:rtl/>
-          <w:sz w:val="24"/>
-          <w:szCs w:val="24"/>
-        </w:rPr>
-        <w:t xml:space="preserve">4.6. يُحقق في أي فرق غير مبرر بين المدخلات والمخرجات المعتمدة؛ وحد التنبيه الداخلي هو 2% من كمية المدخلات (سياسة الشركة)، ويُبلَّغ الفرق إلى جهة الاعتماد عندما يتعذر تفسيره.</w:t>
-      </w:r>
-    </w:p>
-    <w:p>
-      <w:pPr>
-        <w:pStyle w:val="ListeParagraf"/>
-        <w:bidi/>
-        <w:spacing w:after="80"/>
-        <w:ind w:left="0" w:right="709"/>
-        <w:jc w:val="both"/>
-      </w:pPr>
-    </w:p>
-    <w:p>
-      <w:pPr>
-        <w:pStyle w:val="ListeParagraf"/>
-        <w:bidi/>
-        <w:spacing w:before="120" w:after="60"/>
-        <w:ind w:left="0" w:right="709"/>
-      </w:pPr>
-      <w:r>
-        <w:rPr>
-          <w:rFonts w:ascii="Calibri" w:hAnsi="Calibri" w:cs="Arial"/>
-          <w:b/>
-          <w:bCs/>
-          <w:rtl/>
-          <w:sz w:val="24"/>
-          <w:szCs w:val="24"/>
-        </w:rPr>
-        <w:t xml:space="preserve">5. التصنيع لدى الغير</w:t>
-      </w:r>
-    </w:p>
-    <w:p>
-      <w:pPr>
-        <w:pStyle w:val="ListeParagraf"/>
-        <w:bidi/>
-        <w:spacing w:after="80"/>
-        <w:ind w:left="0" w:right="709"/>
-        <w:jc w:val="both"/>
-      </w:pPr>
-      <w:r>
-        <w:rPr>
-          <w:rFonts w:ascii="Calibri" w:hAnsi="Calibri" w:cs="Arial"/>
-          <w:rtl/>
-          <w:sz w:val="24"/>
-          <w:szCs w:val="24"/>
-        </w:rPr>
-        <w:t xml:space="preserve">5.1. لا تُرسل مواد OCS إلا إلى مقاولين من الباطن لديهم شهادة نطاق OCS سارية أو مدرجين ضمن نطاق شهادة EMS.</w:t>
-      </w:r>
-    </w:p>
-    <w:p>
-      <w:pPr>
-        <w:pStyle w:val="ListeParagraf"/>
-        <w:bidi/>
-        <w:spacing w:after="80"/>
-        <w:ind w:left="0" w:right="709"/>
-        <w:jc w:val="both"/>
-      </w:pPr>
-      <w:r>
-        <w:rPr>
-          <w:rFonts w:ascii="Calibri" w:hAnsi="Calibri" w:cs="Arial"/>
-          <w:rtl/>
-          <w:sz w:val="24"/>
-          <w:szCs w:val="24"/>
-        </w:rPr>
-        <w:t xml:space="preserve">5.2. تُسجل كميات الإرسال والإرجاع، ويحافظ المقاول من الباطن على فصل المواد وتمييزها.</w:t>
-      </w:r>
-    </w:p>
-    <w:p>
-      <w:pPr>
-        <w:pStyle w:val="ListeParagraf"/>
-        <w:bidi/>
-        <w:spacing w:after="80"/>
-        <w:ind w:left="0" w:right="709"/>
-        <w:jc w:val="both"/>
-      </w:pPr>
-      <w:r>
-        <w:rPr>
-          <w:rFonts w:ascii="Calibri" w:hAnsi="Calibri" w:cs="Arial"/>
-          <w:rtl/>
-          <w:sz w:val="24"/>
-          <w:szCs w:val="24"/>
-        </w:rPr>
-        <w:t xml:space="preserve">5.3. بالنسبة لطلبيات GOTS، يجب أن يحمل المقاولون من الباطن الذين ينفذون المعالجة الرطبة أو الطباعة أو الخياطة شهادة نطاق GOTS سارية خاصة بهم أو أن يكونوا مدرجين في نطاق EMS؛ ويجوز لـ EMS ولجهة الاعتماد زيارتهم بإعلان مسبق أو دونه.</w:t>
-      </w:r>
-    </w:p>
-    <w:p>
-      <w:pPr>
-        <w:pStyle w:val="ListeParagraf"/>
-        <w:bidi/>
-        <w:spacing w:after="80"/>
-        <w:ind w:left="0" w:right="709"/>
-        <w:jc w:val="both"/>
-      </w:pPr>
-    </w:p>
-    <w:p>
-      <w:pPr>
-        <w:pStyle w:val="ListeParagraf"/>
-        <w:bidi/>
-        <w:spacing w:before="120" w:after="60"/>
-        <w:ind w:left="0" w:right="709"/>
-      </w:pPr>
-      <w:r>
-        <w:rPr>
-          <w:rFonts w:ascii="Calibri" w:hAnsi="Calibri" w:cs="Arial"/>
-          <w:b/>
-          <w:bCs/>
-          <w:rtl/>
-          <w:sz w:val="24"/>
-          <w:szCs w:val="24"/>
-        </w:rPr>
-        <w:t xml:space="preserve">6. الشحن والتوسيم وطلب شهادة المعاملة</w:t>
-      </w:r>
-    </w:p>
-    <w:p>
-      <w:pPr>
-        <w:pStyle w:val="ListeParagraf"/>
-        <w:bidi/>
-        <w:spacing w:after="80"/>
-        <w:ind w:left="0" w:right="709"/>
-        <w:jc w:val="both"/>
-      </w:pPr>
-      <w:r>
-        <w:rPr>
-          <w:rFonts w:ascii="Calibri" w:hAnsi="Calibri" w:cs="Arial"/>
-          <w:rtl/>
-          <w:sz w:val="24"/>
-          <w:szCs w:val="24"/>
-        </w:rPr>
-        <w:t xml:space="preserve">6.1. لا تحمل المنتجات النهائية ادعاءات OCS إلا وفقًا للتصميم المعتمد من العميل وقواعد التوسيم في معيار OCS.</w:t>
-      </w:r>
-    </w:p>
-    <w:p>
-      <w:pPr>
-        <w:pStyle w:val="ListeParagraf"/>
-        <w:bidi/>
-        <w:spacing w:after="80"/>
-        <w:ind w:left="0" w:right="709"/>
-        <w:jc w:val="both"/>
-      </w:pPr>
-      <w:r>
-        <w:rPr>
-          <w:rFonts w:ascii="Calibri" w:hAnsi="Calibri" w:cs="Arial"/>
-          <w:rtl/>
-          <w:sz w:val="24"/>
-          <w:szCs w:val="24"/>
-        </w:rPr>
-        <w:t xml:space="preserve">6.2. بعد الشحن يرسل منسق OCS بيانات الشحنة إلى جهة الاعتماد ويطلب شهادة المعاملة الصادرة في الوقت المحدد.</w:t>
-      </w:r>
-    </w:p>
-    <w:p>
-      <w:pPr>
-        <w:pStyle w:val="ListeParagraf"/>
-        <w:bidi/>
-        <w:spacing w:after="80"/>
-        <w:ind w:left="0" w:right="709"/>
-        <w:jc w:val="both"/>
-      </w:pPr>
-      <w:r>
-        <w:rPr>
-          <w:rFonts w:ascii="Calibri" w:hAnsi="Calibri" w:cs="Arial"/>
-          <w:rtl/>
-          <w:sz w:val="24"/>
-          <w:szCs w:val="24"/>
-        </w:rPr>
-        <w:t xml:space="preserve">6.3. تُحفظ شهادات المعاملات والفواتير وقوائم التعبئة وبوالص الشحن معًا لكل شحنة.</w:t>
-      </w:r>
-    </w:p>
-    <w:p>
-      <w:pPr>
-        <w:pStyle w:val="ListeParagraf"/>
-        <w:bidi/>
-        <w:spacing w:after="80"/>
-        <w:ind w:left="0" w:right="709"/>
-        <w:jc w:val="both"/>
-      </w:pPr>
-      <w:r>
-        <w:rPr>
-          <w:rFonts w:ascii="Calibri" w:hAnsi="Calibri" w:cs="Arial"/>
-          <w:rtl/>
-          <w:sz w:val="24"/>
-          <w:szCs w:val="24"/>
-        </w:rPr>
-        <w:t xml:space="preserve">6.4. قبل الإرسال يُستكمل نموذج الشحن وطلب شهادة المعاملة (EMS.OR.FRM.21.07): تُفحص الملصقات والكراتين والوثائق، ويُذكر رقم الشهادة والادعاء العضوي في وثائق المبيعات.</w:t>
-      </w:r>
-    </w:p>
-    <w:p>
-      <w:pPr>
-        <w:pStyle w:val="ListeParagraf"/>
-        <w:bidi/>
-        <w:spacing w:after="80"/>
-        <w:ind w:left="0" w:right="709"/>
-        <w:jc w:val="both"/>
-      </w:pPr>
-    </w:p>
-    <w:p>
-      <w:pPr>
-        <w:pStyle w:val="ListeParagraf"/>
-        <w:bidi/>
-        <w:spacing w:before="120" w:after="60"/>
-        <w:ind w:left="0" w:right="709"/>
-      </w:pPr>
-      <w:r>
-        <w:rPr>
-          <w:rFonts w:ascii="Calibri" w:hAnsi="Calibri" w:cs="Arial"/>
-          <w:b/>
-          <w:bCs/>
-          <w:rtl/>
-          <w:sz w:val="24"/>
-          <w:szCs w:val="24"/>
-        </w:rPr>
-        <w:t xml:space="preserve">7. المتطلبات البيئية والاجتماعية لمعيار GOTS</w:t>
-      </w:r>
-    </w:p>
-    <w:p>
-      <w:pPr>
-        <w:pStyle w:val="ListeParagraf"/>
-        <w:bidi/>
-        <w:spacing w:after="80"/>
-        <w:ind w:left="0" w:right="709"/>
-        <w:jc w:val="both"/>
-      </w:pPr>
-      <w:r>
-        <w:rPr>
-          <w:rFonts w:ascii="Calibri" w:hAnsi="Calibri" w:cs="Arial"/>
-          <w:rtl/>
-          <w:sz w:val="24"/>
-          <w:szCs w:val="24"/>
-        </w:rPr>
-        <w:t xml:space="preserve">7.1. يعتمد منسق OCS المدخلات الكيميائية (الأصباغ والمواد المساعدة ومواد التجهيز والتنظيف) المستخدمة في طلبيات GOTS وفق معايير GOTS وقائمة ZDHC MRSL قبل شرائها، وتُدرج في جرد المواد الكيميائية (EMS.KM.PRO.20.01).</w:t>
-      </w:r>
-    </w:p>
-    <w:p>
-      <w:pPr>
-        <w:pStyle w:val="ListeParagraf"/>
-        <w:bidi/>
-        <w:spacing w:after="80"/>
-        <w:ind w:left="0" w:right="709"/>
-        <w:jc w:val="both"/>
-      </w:pPr>
-      <w:r>
-        <w:rPr>
-          <w:rFonts w:ascii="Calibri" w:hAnsi="Calibri" w:cs="Arial"/>
-          <w:rtl/>
-          <w:sz w:val="24"/>
-          <w:szCs w:val="24"/>
-        </w:rPr>
-        <w:t xml:space="preserve">7.2. تُخزن المواد الكيميائية المعتمدة بمعزل عن بقية المواد الكيميائية في منطقة تخزين المواد الكيميائية (المنطقة 13)، وتكون موسومة ومعها ورقة بيانات سلامة حديثة، وتُصرف للإنتاج مع تسجيل (EMS.KM.PRO.20.05، EMS.KM.TL.20.02).</w:t>
-      </w:r>
-    </w:p>
-    <w:p>
-      <w:pPr>
-        <w:pStyle w:val="ListeParagraf"/>
-        <w:bidi/>
-        <w:spacing w:after="80"/>
-        <w:ind w:left="0" w:right="709"/>
-        <w:jc w:val="both"/>
-      </w:pPr>
-      <w:r>
-        <w:rPr>
-          <w:rFonts w:ascii="Calibri" w:hAnsi="Calibri" w:cs="Arial"/>
-          <w:rtl/>
-          <w:sz w:val="24"/>
-          <w:szCs w:val="24"/>
-        </w:rPr>
-        <w:t xml:space="preserve">7.3. تُعالج مياه الصرف الناتجة عن المعالجة الرطبة في محطة معالجة المياه وتُراقب وتُسجل النتائج (EMS.ÇV.PRO.19.02).</w:t>
-      </w:r>
-    </w:p>
-    <w:p>
-      <w:pPr>
-        <w:pStyle w:val="ListeParagraf"/>
-        <w:bidi/>
-        <w:spacing w:after="80"/>
-        <w:ind w:left="0" w:right="709"/>
-        <w:jc w:val="both"/>
-      </w:pPr>
-      <w:r>
-        <w:rPr>
-          <w:rFonts w:ascii="Calibri" w:hAnsi="Calibri" w:cs="Arial"/>
-          <w:rtl/>
-          <w:sz w:val="24"/>
-          <w:szCs w:val="24"/>
-        </w:rPr>
-        <w:t xml:space="preserve">7.4. تُفرز النفايات عند المصدر، ولا تُخلط قصاصات المواد العضوية والتقليدية، وتُحفظ النفايات الخطرة في منطقة التخزين المؤقت حتى تجمعها شركة مرخصة (EMS.ÇV.TL.19.01، EMS.ÇV.PRO.19.05).</w:t>
-      </w:r>
-    </w:p>
-    <w:p>
-      <w:pPr>
-        <w:pStyle w:val="ListeParagraf"/>
-        <w:bidi/>
-        <w:spacing w:after="80"/>
-        <w:ind w:left="0" w:right="709"/>
-        <w:jc w:val="both"/>
-      </w:pPr>
-      <w:r>
-        <w:rPr>
-          <w:rFonts w:ascii="Calibri" w:hAnsi="Calibri" w:cs="Arial"/>
-          <w:rtl/>
-          <w:sz w:val="24"/>
-          <w:szCs w:val="24"/>
-        </w:rPr>
-        <w:t xml:space="preserve">7.5. تُطبق المعايير الاجتماعية في GOTS، القائمة على اتفاقيات العمل الدولية الأساسية، من خلال إجراءات الموارد البشرية والامتثال الاجتماعي في EMS، وتُراجع في التدقيق الداخلي السنوي.</w:t>
-      </w:r>
-    </w:p>
-    <w:p>
-      <w:pPr>
-        <w:pStyle w:val="ListeParagraf"/>
-        <w:bidi/>
-        <w:spacing w:after="80"/>
-        <w:ind w:left="0" w:right="709"/>
-        <w:jc w:val="both"/>
-      </w:pPr>
-    </w:p>
-    <w:p>
-      <w:pPr>
-        <w:pStyle w:val="ListeParagraf"/>
-        <w:bidi/>
-        <w:spacing w:before="120" w:after="60"/>
-        <w:ind w:left="0" w:right="709"/>
-      </w:pPr>
-      <w:r>
-        <w:rPr>
-          <w:rFonts w:ascii="Calibri" w:hAnsi="Calibri" w:cs="Arial"/>
-          <w:b/>
-          <w:bCs/>
-          <w:rtl/>
-          <w:sz w:val="24"/>
-          <w:szCs w:val="24"/>
-        </w:rPr>
-        <w:t xml:space="preserve">8. المتابعة والأداء</w:t>
-      </w:r>
-    </w:p>
-    <w:p>
-      <w:pPr>
-        <w:pStyle w:val="ListeParagraf"/>
-        <w:bidi/>
-        <w:spacing w:after="80"/>
-        <w:ind w:left="0" w:right="709"/>
-        <w:jc w:val="both"/>
-      </w:pPr>
-      <w:r>
-        <w:rPr>
-          <w:rFonts w:ascii="Calibri" w:hAnsi="Calibri" w:cs="Arial"/>
-          <w:rtl/>
-          <w:sz w:val="24"/>
-          <w:szCs w:val="24"/>
-        </w:rPr>
-        <w:t xml:space="preserve">8.1. يتابع منسق OCS المؤشرات التالية ويرفعها إلى الإدارة:</w:t>
+          <w:rtl/>
+          <w:sz w:val="24"/>
+          <w:szCs w:val="24"/>
+        </w:rPr>
+        <w:t xml:space="preserve">فرق موازنة الكميات لكل طلبية (الهدف: عدم وجود أي فرق غير مبرر)،</w:t>
       </w:r>
     </w:p>
     <w:p>
@@ -2912,7 +2914,7 @@
           <w:sz w:val="24"/>
           <w:szCs w:val="24"/>
         </w:rPr>
-        <w:t xml:space="preserve">فرق موازنة الكميات لكل طلبية (الهدف: عدم وجود أي فرق غير مبرر)،</w:t>
+        <w:t xml:space="preserve">عدد حالات عدم المطابقة في الفصل أو التوسيم التي تُكتشف في الفحوصات الداخلية والتدقيق،</w:t>
       </w:r>
     </w:p>
     <w:p>
@@ -2933,7 +2935,53 @@
           <w:sz w:val="24"/>
           <w:szCs w:val="24"/>
         </w:rPr>
-        <w:t xml:space="preserve">عدد حالات عدم المطابقة في الفصل أو التوسيم التي تُكتشف في الفحوصات الداخلية والتدقيق،</w:t>
+        <w:t xml:space="preserve">نسبة شهادات المعاملات الواردة المستلمة وشهادات المعاملات الصادرة المطلوبة في الوقت المحدد.</w:t>
+      </w:r>
+    </w:p>
+    <w:p>
+      <w:pPr>
+        <w:pStyle w:val="ListeParagraf"/>
+        <w:bidi/>
+        <w:spacing w:after="80"/>
+        <w:ind w:left="0" w:right="709"/>
+        <w:jc w:val="both"/>
+      </w:pPr>
+      <w:r>
+        <w:rPr>
+          <w:rFonts w:ascii="Calibri" w:hAnsi="Calibri" w:cs="Arial"/>
+          <w:rtl/>
+          <w:sz w:val="24"/>
+          <w:szCs w:val="24"/>
+        </w:rPr>
+        <w:t xml:space="preserve">8.2. يُجرى تدقيق داخلي لمعياري OCS وGOTS سنويًا قبل التدقيق الخارجي، ويتضمن اختبار تتبع لطلبية واحدة على الأقل.</w:t>
+      </w:r>
+    </w:p>
+    <w:p>
+      <w:pPr>
+        <w:pStyle w:val="ListeParagraf"/>
+        <w:bidi/>
+        <w:spacing w:after="80"/>
+        <w:ind w:left="0" w:right="709"/>
+        <w:jc w:val="both"/>
+      </w:pPr>
+    </w:p>
+    <w:p>
+      <w:pPr>
+        <w:pStyle w:val="ListeParagraf"/>
+        <w:bidi/>
+        <w:spacing w:before="120" w:after="60"/>
+        <w:ind w:left="0" w:right="709"/>
+      </w:pPr>
+      <w:r>
+        <w:rPr>
+          <w:rFonts w:ascii="Calibri" w:hAnsi="Calibri" w:cs="Arial"/>
+          <w:b/>
+          <w:bCs/>
+          <w:rtl/>
+          <w:sz w:val="24"/>
+          <w:szCs w:val="24"/>
+        </w:rPr>
+        <w:t xml:space="preserve">9. الوثائق والسجلات ذات الصلة</w:t>
       </w:r>
     </w:p>
     <w:p>
@@ -2954,53 +3002,7 @@
           <w:sz w:val="24"/>
           <w:szCs w:val="24"/>
         </w:rPr>
-        <w:t xml:space="preserve">نسبة شهادات المعاملات الواردة المستلمة وشهادات المعاملات الصادرة المطلوبة في الوقت المحدد.</w:t>
-      </w:r>
-    </w:p>
-    <w:p>
-      <w:pPr>
-        <w:pStyle w:val="ListeParagraf"/>
-        <w:bidi/>
-        <w:spacing w:after="80"/>
-        <w:ind w:left="0" w:right="709"/>
-        <w:jc w:val="both"/>
-      </w:pPr>
-      <w:r>
-        <w:rPr>
-          <w:rFonts w:ascii="Calibri" w:hAnsi="Calibri" w:cs="Arial"/>
-          <w:rtl/>
-          <w:sz w:val="24"/>
-          <w:szCs w:val="24"/>
-        </w:rPr>
-        <w:t xml:space="preserve">8.2. يُجرى تدقيق داخلي لمعياري OCS وGOTS سنويًا قبل التدقيق الخارجي، ويتضمن اختبار تتبع لطلبية واحدة على الأقل.</w:t>
-      </w:r>
-    </w:p>
-    <w:p>
-      <w:pPr>
-        <w:pStyle w:val="ListeParagraf"/>
-        <w:bidi/>
-        <w:spacing w:after="80"/>
-        <w:ind w:left="0" w:right="709"/>
-        <w:jc w:val="both"/>
-      </w:pPr>
-    </w:p>
-    <w:p>
-      <w:pPr>
-        <w:pStyle w:val="ListeParagraf"/>
-        <w:bidi/>
-        <w:spacing w:before="120" w:after="60"/>
-        <w:ind w:left="0" w:right="709"/>
-      </w:pPr>
-      <w:r>
-        <w:rPr>
-          <w:rFonts w:ascii="Calibri" w:hAnsi="Calibri" w:cs="Arial"/>
-          <w:b/>
-          <w:bCs/>
-          <w:rtl/>
-          <w:sz w:val="24"/>
-          <w:szCs w:val="24"/>
-        </w:rPr>
-        <w:t xml:space="preserve">9. الوثائق والسجلات ذات الصلة</w:t>
+        <w:t xml:space="preserve">شهادات نطاق الموردين وشهادات المعاملات الواردة</w:t>
       </w:r>
     </w:p>
     <w:p>
@@ -3021,7 +3023,7 @@
           <w:sz w:val="24"/>
           <w:szCs w:val="24"/>
         </w:rPr>
-        <w:t xml:space="preserve">شهادات نطاق الموردين وشهادات المعاملات الواردة</w:t>
+        <w:t xml:space="preserve">سجل دفعات OCS وسجلات حركة المواد</w:t>
       </w:r>
     </w:p>
     <w:p>
@@ -3042,7 +3044,7 @@
           <w:sz w:val="24"/>
           <w:szCs w:val="24"/>
         </w:rPr>
-        <w:t xml:space="preserve">سجل دفعات OCS وسجلات حركة المواد</w:t>
+        <w:t xml:space="preserve">سجلات تفريغ الخط</w:t>
       </w:r>
     </w:p>
     <w:p>
@@ -3063,7 +3065,7 @@
           <w:sz w:val="24"/>
           <w:szCs w:val="24"/>
         </w:rPr>
-        <w:t xml:space="preserve">سجلات تفريغ الخط</w:t>
+        <w:t xml:space="preserve">سجلات موازنة الكميات</w:t>
       </w:r>
     </w:p>
     <w:p>
@@ -3084,7 +3086,7 @@
           <w:sz w:val="24"/>
           <w:szCs w:val="24"/>
         </w:rPr>
-        <w:t xml:space="preserve">سجلات موازنة الكميات</w:t>
+        <w:t xml:space="preserve">شهادات المعاملات الصادرة ووثائق الشحن</w:t>
       </w:r>
     </w:p>
     <w:p>
@@ -3105,7 +3107,7 @@
           <w:sz w:val="24"/>
           <w:szCs w:val="24"/>
         </w:rPr>
-        <w:t xml:space="preserve">شهادات المعاملات الصادرة ووثائق الشحن</w:t>
+        <w:t xml:space="preserve">EMS.OR.POL.21.01. سياسة المحتوى العضوي</w:t>
       </w:r>
     </w:p>
     <w:p>
@@ -3126,7 +3128,7 @@
           <w:sz w:val="24"/>
           <w:szCs w:val="24"/>
         </w:rPr>
-        <w:t xml:space="preserve">EMS.OR.POL.21.01. سياسة المحتوى العضوي</w:t>
+        <w:t xml:space="preserve">EMS.OR.PRO.21.02. إجراء فصل مناطق الإنتاج العضوي وتمييزها بصريًا</w:t>
       </w:r>
     </w:p>
     <w:p>
@@ -3147,7 +3149,7 @@
           <w:sz w:val="24"/>
           <w:szCs w:val="24"/>
         </w:rPr>
-        <w:t xml:space="preserve">EMS.OR.PRO.21.02. إجراء فصل مناطق الإنتاج العضوي وتمييزها بصريًا</w:t>
+        <w:t xml:space="preserve">EMS.OR.TL.21.02. تعليمات التنظيف عند تبديل المنطقة وتفريغ الخط في الإنتاج العضوي</w:t>
       </w:r>
     </w:p>
     <w:p>
@@ -3168,7 +3170,7 @@
           <w:sz w:val="24"/>
           <w:szCs w:val="24"/>
         </w:rPr>
-        <w:t xml:space="preserve">EMS.OR.TL.21.02. تعليمات التنظيف عند تبديل المنطقة وتفريغ الخط في الإنتاج العضوي</w:t>
+        <w:t xml:space="preserve">EMS.OR.PRO.21.03. إجراء فحص مناطق الإنتاج العضوي والتدريب والكفاءة</w:t>
       </w:r>
     </w:p>
     <w:p>
@@ -3189,7 +3191,7 @@
           <w:sz w:val="24"/>
           <w:szCs w:val="24"/>
         </w:rPr>
-        <w:t xml:space="preserve">EMS.OR.PRO.21.03. إجراء فحص مناطق الإنتاج العضوي والتدريب والكفاءة</w:t>
+        <w:t xml:space="preserve">النماذج EMS.OR.FRM.21.01 إلى EMS.OR.FRM.21.08 (الاستلام والتحقق من شهادة المعاملة، سجل الدفعات، سجل التبديل، موازنة الكتلة، اعتماد الملصقات، قائمة الفحص اليومية للمناطق، الشحن وطلب شهادة المعاملة، سجل التدريب)</w:t>
       </w:r>
     </w:p>
     <w:p>
@@ -3210,7 +3212,7 @@
           <w:sz w:val="24"/>
           <w:szCs w:val="24"/>
         </w:rPr>
-        <w:t xml:space="preserve">النماذج EMS.OR.FRM.21.01 إلى EMS.OR.FRM.21.08 (الاستلام والتحقق من شهادة المعاملة، سجل الدفعات، سجل التبديل، موازنة الكتلة، اعتماد الملصقات، قائمة الفحص اليومية للمناطق، الشحن وطلب شهادة المعاملة، سجل التدريب)</w:t>
+        <w:t xml:space="preserve">EMS.OR.FRM.21.20. سجل استلام واستخدام المواد الكيميائية العضوية</w:t>
       </w:r>
     </w:p>
     <w:p>
@@ -3231,7 +3233,7 @@
           <w:sz w:val="24"/>
           <w:szCs w:val="24"/>
         </w:rPr>
-        <w:t xml:space="preserve">EMS.KM.PRO.20.01. إجراء جرد المواد الكيميائية والمطابقة لقائمة ZDHC MRSL</w:t>
+        <w:t xml:space="preserve">EMS.OR.TL.21.15. تعليمات منطقة تخزين المواد الكيميائية العضوية</w:t>
       </w:r>
     </w:p>
     <w:p>
@@ -3252,7 +3254,7 @@
           <w:sz w:val="24"/>
           <w:szCs w:val="24"/>
         </w:rPr>
-        <w:t xml:space="preserve">EMS.KM.PRO.20.05. إجراء تخزين المواد الكيميائية ومناولتها</w:t>
+        <w:t xml:space="preserve">EMS.OR.TL.21.16. تعليمات منطقة الفرز والنفايات العضوية</w:t>
       </w:r>
     </w:p>
     <w:p>
@@ -3273,7 +3275,7 @@
           <w:sz w:val="24"/>
           <w:szCs w:val="24"/>
         </w:rPr>
-        <w:t xml:space="preserve">EMS.ÇV.PRO.19.02. إجراء إدارة مياه الصرف ومراقبتها</w:t>
+        <w:t xml:space="preserve">EMS.OR.TL.21.01. تعليمات تمييز المنتجات العضوية وتوسيمها</w:t>
       </w:r>
     </w:p>
     <w:p>
@@ -3294,7 +3296,7 @@
           <w:sz w:val="24"/>
           <w:szCs w:val="24"/>
         </w:rPr>
-        <w:t xml:space="preserve">EMS.ÇV.TL.19.01. تعليمات فصل النفايات</w:t>
+        <w:t xml:space="preserve">EMS.OR.PRO.21.01. إجراء مناولة مواد OCS وفصلها وتتبعها</w:t>
       </w:r>
     </w:p>
     <w:p>
@@ -3315,49 +3317,7 @@
           <w:sz w:val="24"/>
           <w:szCs w:val="24"/>
         </w:rPr>
-        <w:t xml:space="preserve">EMS.GR.PRO.14.02. إجراء شهادات المعاملات والتوسيم</w:t>
-      </w:r>
-    </w:p>
-    <w:p>
-      <w:pPr>
-        <w:pStyle w:val="ListeParagraf"/>
-        <w:numPr>
-          <w:ilvl w:val="0"/>
-          <w:numId w:val="1"/>
-        </w:numPr>
-        <w:bidi/>
-        <w:spacing w:after="60"/>
-        <w:jc w:val="both"/>
-      </w:pPr>
-      <w:r>
-        <w:rPr>
-          <w:rFonts w:ascii="Calibri" w:hAnsi="Calibri" w:cs="Arial"/>
-          <w:rtl/>
-          <w:sz w:val="24"/>
-          <w:szCs w:val="24"/>
-        </w:rPr>
-        <w:t xml:space="preserve">EMS.QA.PRO.02.08. إجراء التتبع واستدعاء المنتجات</w:t>
-      </w:r>
-    </w:p>
-    <w:p>
-      <w:pPr>
-        <w:pStyle w:val="ListeParagraf"/>
-        <w:numPr>
-          <w:ilvl w:val="0"/>
-          <w:numId w:val="1"/>
-        </w:numPr>
-        <w:bidi/>
-        <w:spacing w:after="60"/>
-        <w:jc w:val="both"/>
-      </w:pPr>
-      <w:r>
-        <w:rPr>
-          <w:rFonts w:ascii="Calibri" w:hAnsi="Calibri" w:cs="Arial"/>
-          <w:rtl/>
-          <w:sz w:val="24"/>
-          <w:szCs w:val="24"/>
-        </w:rPr>
-        <w:t xml:space="preserve">EMS.DP.PRO.08.01. إجراء استلام المواد وتخزينها</w:t>
+        <w:t xml:space="preserve">EMS.OR.TL.21.03. تعليمات منطقة المواد الخام العضوية</w:t>
       </w:r>
     </w:p>
     <w:p>

</xml_diff>